<commit_message>
Update customer report: third exclusion case, supplier-tier analysis, payment risk
Co-Authored-By: Claude Fable 5 <noreply@anthropic.com>
Claude-Session: https://claude.ai/code/session_01D8V4YsNDSgybhuKSqPBmt4
</commit_message>
<xml_diff>
--- a/docs/shandong-botong/JSTech_Sourcing_Progress_Report.docx
+++ b/docs/shandong-botong/JSTech_Sourcing_Progress_Report.docx
@@ -91,7 +91,7 @@
           <w:sz w:val="19"/>
           <w:szCs w:val="19"/>
         </w:rPr>
-        <w:t xml:space="preserve">중국 내 약 15개사를 검토하여 9개사를 문서화하고 7개사로부터 견적을 확보했습니다. 이 중 2개사는 현지 실사 및 직접 확인을 거쳐 제외했으며, 그 2개사가 공교롭게도 견적 최저가 업체였습니다. 대구경(φ450×30×3000, φ460×8×3000) 실제 생산이 가능한 업체를 4개사로 압축하여 검증에 착수했습니다.</w:t>
+        <w:t xml:space="preserve">중국 내 약 15개사를 검토하여 9개사를 문서화하고 7개사로부터 견적을 확보했습니다. 이 중 3개사는 현지 실사·직접 확인·법인 조회를 거쳐 제외했으며, 제외한 업체 중 2개사가 견적 최저가였습니다. 대구경(φ450×30×3000, φ460×8×3000) 실제 생산이 가능한 업체를 3개사로 압축하여 검증에 착수했습니다.</w:t>
       </w:r>
     </w:p>
     <w:p>
@@ -105,7 +105,7 @@
           <w:sz w:val="20"/>
           <w:szCs w:val="20"/>
         </w:rPr>
-        <w:t xml:space="preserve">본 보고서는 지금까지의 검토 경과, 두 건의 현장 검증에서 확인한 사실, 그리고 대구경 스펙이 요구하는 기술적 조건을 정리한 것입니다.</w:t>
+        <w:t xml:space="preserve">본 보고서는 지금까지의 검토 경과, 세 건의 실체 검증에서 확인한 사실, 대구경 스펙이 요구하는 기술적 조건, 그리고 대금·납기 관련 위험과 대응 방안을 정리한 것입니다.</w:t>
       </w:r>
     </w:p>
     <w:p>
@@ -521,7 +521,7 @@
                 <w:sz w:val="18"/>
                 <w:szCs w:val="18"/>
               </w:rPr>
-              <w:t xml:space="preserve">2개사 제외</w:t>
+              <w:t xml:space="preserve">3개사 제외</w:t>
             </w:r>
           </w:p>
         </w:tc>
@@ -548,7 +548,7 @@
                 <w:sz w:val="18"/>
                 <w:szCs w:val="18"/>
               </w:rPr>
-              <w:t xml:space="preserve">톈진 현지 방문 1건, 중국 현지 파트너 직접 확인 1건</w:t>
+              <w:t xml:space="preserve">톈진 현지 방문 1건, 중국 현지 파트너 직접 확인 1건, 법인 등록 정보 조회 1건</w:t>
             </w:r>
           </w:p>
         </w:tc>
@@ -604,7 +604,7 @@
                 <w:sz w:val="18"/>
                 <w:szCs w:val="18"/>
               </w:rPr>
-              <w:t xml:space="preserve">4개사 검증 중</w:t>
+              <w:t xml:space="preserve">3개사 검증 중</w:t>
             </w:r>
           </w:p>
         </w:tc>
@@ -631,7 +631,7 @@
                 <w:sz w:val="18"/>
                 <w:szCs w:val="18"/>
               </w:rPr>
-              <w:t xml:space="preserve">대구경 생산 가능 설비를 보유한 대형 제조사 대상</w:t>
+              <w:t xml:space="preserve">대구경 생산 가능 설비를 보유한 중견 제조사 대상</w:t>
             </w:r>
           </w:p>
         </w:tc>
@@ -681,7 +681,7 @@
           <w:sz w:val="24"/>
           <w:szCs w:val="24"/>
         </w:rPr>
-        <w:t xml:space="preserve">2. 실체 검증으로 제외한 사례 (2건)</w:t>
+        <w:t xml:space="preserve">2. 실체 검증으로 제외한 사례 (3건)</w:t>
       </w:r>
     </w:p>
     <w:p>
@@ -1511,6 +1511,326 @@
     </w:p>
     <w:p>
       <w:pPr>
+        <w:spacing w:after="70" w:before="190"/>
+      </w:pPr>
+      <w:r>
+        <w:rPr>
+          <w:b/>
+          <w:bCs/>
+          <w:color w:val="2E5878"/>
+          <w:sz w:val="21"/>
+          <w:szCs w:val="21"/>
+        </w:rPr>
+        <w:t xml:space="preserve">사례 ③ 상호 차용 업체 — 법인 확인 후 제외</w:t>
+      </w:r>
+    </w:p>
+    <w:tbl>
+      <w:tblPr>
+        <w:tblW w:type="dxa" w:w="9306"/>
+        <w:tblBorders>
+          <w:top w:val="single" w:color="auto" w:sz="4"/>
+          <w:left w:val="single" w:color="auto" w:sz="4"/>
+          <w:bottom w:val="single" w:color="auto" w:sz="4"/>
+          <w:right w:val="single" w:color="auto" w:sz="4"/>
+          <w:insideH w:val="single" w:color="auto" w:sz="4"/>
+          <w:insideV w:val="single" w:color="auto" w:sz="4"/>
+        </w:tblBorders>
+      </w:tblPr>
+      <w:tblGrid>
+        <w:gridCol w:w="2400"/>
+        <w:gridCol w:w="6906"/>
+      </w:tblGrid>
+      <w:tr>
+        <w:tc>
+          <w:tcPr>
+            <w:tcW w:type="dxa" w:w="2400"/>
+            <w:shd w:fill="E4EEF1" w:val="clear"/>
+            <w:tcMar>
+              <w:top w:type="dxa" w:w="55"/>
+              <w:left w:type="dxa" w:w="95"/>
+              <w:bottom w:type="dxa" w:w="55"/>
+              <w:right w:type="dxa" w:w="95"/>
+            </w:tcMar>
+            <w:vAlign w:val="center"/>
+          </w:tcPr>
+          <w:p>
+            <w:pPr>
+              <w:spacing w:after="0"/>
+            </w:pPr>
+            <w:r>
+              <w:rPr>
+                <w:b/>
+                <w:bCs/>
+                <w:color w:val="2E5878"/>
+                <w:sz w:val="18"/>
+                <w:szCs w:val="18"/>
+              </w:rPr>
+              <w:t xml:space="preserve">구분</w:t>
+            </w:r>
+          </w:p>
+        </w:tc>
+        <w:tc>
+          <w:tcPr>
+            <w:tcW w:type="dxa" w:w="6906"/>
+            <w:shd w:fill="E4EEF1" w:val="clear"/>
+            <w:tcMar>
+              <w:top w:type="dxa" w:w="55"/>
+              <w:left w:type="dxa" w:w="95"/>
+              <w:bottom w:type="dxa" w:w="55"/>
+              <w:right w:type="dxa" w:w="95"/>
+            </w:tcMar>
+            <w:vAlign w:val="center"/>
+          </w:tcPr>
+          <w:p>
+            <w:pPr>
+              <w:spacing w:after="0"/>
+            </w:pPr>
+            <w:r>
+              <w:rPr>
+                <w:b/>
+                <w:bCs/>
+                <w:color w:val="2E5878"/>
+                <w:sz w:val="18"/>
+                <w:szCs w:val="18"/>
+              </w:rPr>
+              <w:t xml:space="preserve">내용</w:t>
+            </w:r>
+          </w:p>
+        </w:tc>
+      </w:tr>
+      <w:tr>
+        <w:tc>
+          <w:tcPr>
+            <w:tcW w:type="dxa" w:w="2400"/>
+            <w:tcMar>
+              <w:top w:type="dxa" w:w="55"/>
+              <w:left w:type="dxa" w:w="95"/>
+              <w:bottom w:type="dxa" w:w="55"/>
+              <w:right w:type="dxa" w:w="95"/>
+            </w:tcMar>
+            <w:vAlign w:val="center"/>
+          </w:tcPr>
+          <w:p>
+            <w:pPr>
+              <w:spacing w:after="0"/>
+            </w:pPr>
+            <w:r>
+              <w:rPr>
+                <w:b w:val="false"/>
+                <w:bCs w:val="false"/>
+                <w:sz w:val="18"/>
+                <w:szCs w:val="18"/>
+              </w:rPr>
+              <w:t xml:space="preserve">검토 사유</w:t>
+            </w:r>
+          </w:p>
+        </w:tc>
+        <w:tc>
+          <w:tcPr>
+            <w:tcW w:type="dxa" w:w="6906"/>
+            <w:tcMar>
+              <w:top w:type="dxa" w:w="55"/>
+              <w:left w:type="dxa" w:w="95"/>
+              <w:bottom w:type="dxa" w:w="55"/>
+              <w:right w:type="dxa" w:w="95"/>
+            </w:tcMar>
+            <w:vAlign w:val="center"/>
+          </w:tcPr>
+          <w:p>
+            <w:pPr>
+              <w:spacing w:after="0"/>
+            </w:pPr>
+            <w:r>
+              <w:rPr>
+                <w:b w:val="false"/>
+                <w:bCs w:val="false"/>
+                <w:sz w:val="18"/>
+                <w:szCs w:val="18"/>
+              </w:rPr>
+              <w:t xml:space="preserve">중국 최대 국영 알루미늄 기업과 동일한 영문 브랜드명을 사용. 홈페이지에 초대형 압출설비, 항공우주 인증(AS9100, NADCAP) 보유를 표기</w:t>
+            </w:r>
+          </w:p>
+        </w:tc>
+      </w:tr>
+      <w:tr>
+        <w:tc>
+          <w:tcPr>
+            <w:tcW w:type="dxa" w:w="2400"/>
+            <w:tcMar>
+              <w:top w:type="dxa" w:w="55"/>
+              <w:left w:type="dxa" w:w="95"/>
+              <w:bottom w:type="dxa" w:w="55"/>
+              <w:right w:type="dxa" w:w="95"/>
+            </w:tcMar>
+            <w:vAlign w:val="center"/>
+          </w:tcPr>
+          <w:p>
+            <w:pPr>
+              <w:spacing w:after="0"/>
+            </w:pPr>
+            <w:r>
+              <w:rPr>
+                <w:b w:val="false"/>
+                <w:bCs w:val="false"/>
+                <w:sz w:val="18"/>
+                <w:szCs w:val="18"/>
+              </w:rPr>
+              <w:t xml:space="preserve">검증 방법</w:t>
+            </w:r>
+          </w:p>
+        </w:tc>
+        <w:tc>
+          <w:tcPr>
+            <w:tcW w:type="dxa" w:w="6906"/>
+            <w:tcMar>
+              <w:top w:type="dxa" w:w="55"/>
+              <w:left w:type="dxa" w:w="95"/>
+              <w:bottom w:type="dxa" w:w="55"/>
+              <w:right w:type="dxa" w:w="95"/>
+            </w:tcMar>
+            <w:vAlign w:val="center"/>
+          </w:tcPr>
+          <w:p>
+            <w:pPr>
+              <w:spacing w:after="0"/>
+            </w:pPr>
+            <w:r>
+              <w:rPr>
+                <w:b w:val="false"/>
+                <w:bCs w:val="false"/>
+                <w:sz w:val="18"/>
+                <w:szCs w:val="18"/>
+              </w:rPr>
+              <w:t xml:space="preserve">법인 등록 정보 및 공식 도메인 대조</w:t>
+            </w:r>
+          </w:p>
+        </w:tc>
+      </w:tr>
+      <w:tr>
+        <w:tc>
+          <w:tcPr>
+            <w:tcW w:type="dxa" w:w="2400"/>
+            <w:tcMar>
+              <w:top w:type="dxa" w:w="55"/>
+              <w:left w:type="dxa" w:w="95"/>
+              <w:bottom w:type="dxa" w:w="55"/>
+              <w:right w:type="dxa" w:w="95"/>
+            </w:tcMar>
+            <w:vAlign w:val="center"/>
+          </w:tcPr>
+          <w:p>
+            <w:pPr>
+              <w:spacing w:after="0"/>
+            </w:pPr>
+            <w:r>
+              <w:rPr>
+                <w:b w:val="false"/>
+                <w:bCs w:val="false"/>
+                <w:sz w:val="18"/>
+                <w:szCs w:val="18"/>
+              </w:rPr>
+              <w:t xml:space="preserve">확인 결과</w:t>
+            </w:r>
+          </w:p>
+        </w:tc>
+        <w:tc>
+          <w:tcPr>
+            <w:tcW w:type="dxa" w:w="6906"/>
+            <w:tcMar>
+              <w:top w:type="dxa" w:w="55"/>
+              <w:left w:type="dxa" w:w="95"/>
+              <w:bottom w:type="dxa" w:w="55"/>
+              <w:right w:type="dxa" w:w="95"/>
+            </w:tcMar>
+            <w:vAlign w:val="center"/>
+          </w:tcPr>
+          <w:p>
+            <w:pPr>
+              <w:spacing w:after="0"/>
+            </w:pPr>
+            <w:r>
+              <w:rPr>
+                <w:b w:val="false"/>
+                <w:bCs w:val="false"/>
+                <w:sz w:val="18"/>
+                <w:szCs w:val="18"/>
+              </w:rPr>
+              <w:t xml:space="preserve">해당 국영 기업과 무관한 별개 법인. 홈페이지에 게시된 설비·인증 내용은 자체 보유 근거가 확인되지 않음</w:t>
+            </w:r>
+          </w:p>
+        </w:tc>
+      </w:tr>
+      <w:tr>
+        <w:tc>
+          <w:tcPr>
+            <w:tcW w:type="dxa" w:w="2400"/>
+            <w:tcMar>
+              <w:top w:type="dxa" w:w="55"/>
+              <w:left w:type="dxa" w:w="95"/>
+              <w:bottom w:type="dxa" w:w="55"/>
+              <w:right w:type="dxa" w:w="95"/>
+            </w:tcMar>
+            <w:vAlign w:val="center"/>
+          </w:tcPr>
+          <w:p>
+            <w:pPr>
+              <w:spacing w:after="0"/>
+            </w:pPr>
+            <w:r>
+              <w:rPr>
+                <w:b w:val="false"/>
+                <w:bCs w:val="false"/>
+                <w:sz w:val="18"/>
+                <w:szCs w:val="18"/>
+              </w:rPr>
+              <w:t xml:space="preserve">조치</w:t>
+            </w:r>
+          </w:p>
+        </w:tc>
+        <w:tc>
+          <w:tcPr>
+            <w:tcW w:type="dxa" w:w="6906"/>
+            <w:tcMar>
+              <w:top w:type="dxa" w:w="55"/>
+              <w:left w:type="dxa" w:w="95"/>
+              <w:bottom w:type="dxa" w:w="55"/>
+              <w:right w:type="dxa" w:w="95"/>
+            </w:tcMar>
+            <w:vAlign w:val="center"/>
+          </w:tcPr>
+          <w:p>
+            <w:pPr>
+              <w:spacing w:after="0"/>
+            </w:pPr>
+            <w:r>
+              <w:rPr>
+                <w:b w:val="false"/>
+                <w:bCs w:val="false"/>
+                <w:sz w:val="18"/>
+                <w:szCs w:val="18"/>
+              </w:rPr>
+              <w:t xml:space="preserve">후보에서 제외. 국영 기업 계열사 접촉은 공식 경로로 별도 진행</w:t>
+            </w:r>
+          </w:p>
+        </w:tc>
+      </w:tr>
+    </w:tbl>
+    <w:p>
+      <w:pPr>
+        <w:spacing w:after="70"/>
+      </w:pPr>
+      <w:r>
+        <w:rPr>
+          <w:b w:val="false"/>
+          <w:bCs w:val="false"/>
+          <w:sz w:val="20"/>
+          <w:szCs w:val="20"/>
+        </w:rPr>
+        <w:t xml:space="preserve"/>
+      </w:r>
+    </w:p>
+    <w:p>
+      <w:pPr>
         <w:pBdr>
           <w:top w:val="single" w:color="5A9A96" w:sz="4"/>
           <w:left w:val="single" w:color="5A9A96" w:sz="24"/>
@@ -1527,7 +1847,7 @@
           <w:sz w:val="20"/>
           <w:szCs w:val="20"/>
         </w:rPr>
-        <w:t xml:space="preserve">두 사례의 공통점</w:t>
+        <w:t xml:space="preserve">세 사례의 공통점</w:t>
       </w:r>
     </w:p>
     <w:p>
@@ -1546,7 +1866,7 @@
           <w:sz w:val="19"/>
           <w:szCs w:val="19"/>
         </w:rPr>
-        <w:t xml:space="preserve">제외한 2개사가 모두 검토 업체 중 최저가였습니다. 실제 생산설비가 없는 중개업체는 생산 원가의 제약을 받지 않으므로 어떤 가격이든 제시할 수 있습니다. 따라서 대구경 알루미늄관 조달에서 가격 순위는 신뢰할 수 있는 선정 기준이 되지 못하며, 실체 검증이 선행되어야 합니다.</w:t>
+        <w:t xml:space="preserve">제외한 3개사 중 2개사는 검토 업체 중 최저가였고, 2개사는 국내에도 알려진 중국 대형 기업과 동일하거나 유사한 상호를 사용하고 있었습니다. 실제 생산설비가 없는 중개업체는 생산 원가의 제약을 받지 않으므로 어떤 가격이든 제시할 수 있으며, 홈페이지의 설비·인증 표기는 자사 보유 여부와 무관하게 게시될 수 있습니다. 따라서 가격 순위와 홈페이지 자료는 선정 기준이 되지 못하며, 법인 등록 정보 조회와 현장 확인이 선행되어야 합니다.</w:t>
       </w:r>
     </w:p>
     <w:p>
@@ -1666,6 +1986,46 @@
           <w:szCs w:val="20"/>
         </w:rPr>
         <w:t xml:space="preserve"/>
+      </w:r>
+    </w:p>
+    <w:p>
+      <w:pPr>
+        <w:pBdr>
+          <w:top w:val="single" w:color="5A9A96" w:sz="4"/>
+          <w:left w:val="single" w:color="5A9A96" w:sz="24"/>
+        </w:pBdr>
+        <w:shd w:fill="EAF2F4" w:val="clear"/>
+        <w:spacing w:after="0" w:before="80"/>
+        <w:ind w:left="160" w:right="160"/>
+      </w:pPr>
+      <w:r>
+        <w:rPr>
+          <w:b/>
+          <w:bCs/>
+          <w:color w:val="1F3D4A"/>
+          <w:sz w:val="20"/>
+          <w:szCs w:val="20"/>
+        </w:rPr>
+        <w:t xml:space="preserve">위탁생산 자체는 결격 사유가 아닙니다</w:t>
+      </w:r>
+    </w:p>
+    <w:p>
+      <w:pPr>
+        <w:pBdr>
+          <w:bottom w:val="single" w:color="5A9A96" w:sz="4"/>
+          <w:left w:val="single" w:color="5A9A96" w:sz="24"/>
+        </w:pBdr>
+        <w:shd w:fill="EAF2F4" w:val="clear"/>
+        <w:spacing w:after="120" w:before="30"/>
+        <w:ind w:left="160" w:right="160"/>
+      </w:pPr>
+      <w:r>
+        <w:rPr>
+          <w:color w:val="203038"/>
+          <w:sz w:val="19"/>
+          <w:szCs w:val="19"/>
+        </w:rPr>
+        <w:t xml:space="preserve">자사 설비를 초과하는 규격을 협력 공장에 위탁하는 것은 중국 알루미늄 업계의 일반적인 거래 형태이며, 소량 발주가 성사되기 위해서는 오히려 필요한 구조인 경우가 많습니다(5-2 참조). 문제는 위탁 여부가 아니라, 실제 생산 공장이 공개되고 실사가 가능한지 여부입니다.</w:t>
       </w:r>
     </w:p>
     <w:p>
@@ -1687,7 +2047,7 @@
           <w:sz w:val="19"/>
           <w:szCs w:val="19"/>
         </w:rPr>
-        <w:t xml:space="preserve">대구경 생산처가 톈진 소재라는 점은 추가 확인이 필요한 사안입니다. 당사는 이미 톈진 소재 업체 1개사를 현지 방문하여 중개업체로 확인하고 제외한 경험이 있습니다. 따라서 협력사의 실체 확인과 현장 방문 없이는 대구경 발주를 진행할 수 없다는 입장을 전달했습니다.</w:t>
+        <w:t xml:space="preserve">다만 대구경 생산처가 톈진 소재라는 점은 추가 확인이 필요합니다. 당사는 이미 톈진 소재 업체 1개사를 현지 방문하여 중개업체로 확인하고 제외한 경험이 있습니다(사례 ①). 따라서 협력사의 실체 확인과 현장 방문 없이는 대구경 발주를 진행할 수 없다는 입장을 전달했으며, 공급사는 방문 주선에 동의했습니다.</w:t>
       </w:r>
     </w:p>
     <w:p>
@@ -2532,7 +2892,7 @@
                 <w:sz w:val="18"/>
                 <w:szCs w:val="18"/>
               </w:rPr>
-              <w:t xml:space="preserve">설비 근거</w:t>
+              <w:t xml:space="preserve">설비 근거 (공개 자료 기준)</w:t>
             </w:r>
           </w:p>
         </w:tc>
@@ -2588,7 +2948,7 @@
                 <w:sz w:val="18"/>
                 <w:szCs w:val="18"/>
               </w:rPr>
-              <w:t xml:space="preserve">국영 대형 알루미늄 기업</w:t>
+              <w:t xml:space="preserve">산둥 소재 대형 제조사 D</w:t>
             </w:r>
           </w:p>
         </w:tc>
@@ -2614,7 +2974,7 @@
                 <w:sz w:val="18"/>
                 <w:szCs w:val="18"/>
               </w:rPr>
-              <w:t xml:space="preserve">5만톤 수직 열간압출기, 최대 외경 1,320mm × 길이 12m. 항공우주 인증(AS9100, NADCAP) 보유</w:t>
+              <w:t xml:space="preserve">150MN(15,000톤) 압출기 보유, 관 외경 700mm까지 공식 표기. 국영 에너지그룹 계열. 보통사와 동일 시(市) 소재</w:t>
             </w:r>
           </w:p>
         </w:tc>
@@ -2640,7 +3000,7 @@
                 <w:sz w:val="18"/>
                 <w:szCs w:val="18"/>
               </w:rPr>
-              <w:t xml:space="preserve">열간압출 심리스 대응 가능 여부, 소량 수주 조건</w:t>
+              <w:t xml:space="preserve">소량 수주 가능 여부, 최소 계량중량</w:t>
             </w:r>
           </w:p>
         </w:tc>
@@ -2668,7 +3028,7 @@
                 <w:sz w:val="18"/>
                 <w:szCs w:val="18"/>
               </w:rPr>
-              <w:t xml:space="preserve">산둥 소재 대형 제조사 D</w:t>
+              <w:t xml:space="preserve">산둥 소재 대형 제조사 E</w:t>
             </w:r>
           </w:p>
         </w:tc>
@@ -2694,7 +3054,7 @@
                 <w:sz w:val="18"/>
                 <w:szCs w:val="18"/>
               </w:rPr>
-              <w:t xml:space="preserve">150MN(15,000톤) 압출기, 관 외경 700mm까지. 보통사와 동일 시(市) 소재</w:t>
+              <w:t xml:space="preserve">압출기 18대(만톤급 포함). 유사 규격(φ461×8) 생산 실적을 자사 자료에 공개</w:t>
             </w:r>
           </w:p>
         </w:tc>
@@ -2720,7 +3080,7 @@
                 <w:sz w:val="18"/>
                 <w:szCs w:val="18"/>
               </w:rPr>
-              <w:t xml:space="preserve">소량 수주 가능 여부, 최소 계량중량</w:t>
+              <w:t xml:space="preserve">해당 실적의 재질·공법 확인, 무계목 여부</w:t>
             </w:r>
           </w:p>
         </w:tc>
@@ -2748,7 +3108,7 @@
                 <w:sz w:val="18"/>
                 <w:szCs w:val="18"/>
               </w:rPr>
-              <w:t xml:space="preserve">산둥 소재 대형 제조사 E</w:t>
+              <w:t xml:space="preserve">톈진 소재 제조사 F</w:t>
             </w:r>
           </w:p>
         </w:tc>
@@ -2774,7 +3134,7 @@
                 <w:sz w:val="18"/>
                 <w:szCs w:val="18"/>
               </w:rPr>
-              <w:t xml:space="preserve">압출기 18대(만톤급 포함). 유사 규격(φ461×8) 생산 실적 공개</w:t>
+              <w:t xml:space="preserve">대형 압출기 보유 표기, 대구경 단조관 취급</w:t>
             </w:r>
           </w:p>
         </w:tc>
@@ -2800,87 +3160,7 @@
                 <w:sz w:val="18"/>
                 <w:szCs w:val="18"/>
               </w:rPr>
-              <w:t xml:space="preserve">해당 실적의 재질·공법 확인</w:t>
-            </w:r>
-          </w:p>
-        </w:tc>
-      </w:tr>
-      <w:tr>
-        <w:tc>
-          <w:tcPr>
-            <w:tcW w:type="dxa" w:w="2500"/>
-            <w:tcMar>
-              <w:top w:type="dxa" w:w="55"/>
-              <w:left w:type="dxa" w:w="95"/>
-              <w:bottom w:type="dxa" w:w="55"/>
-              <w:right w:type="dxa" w:w="95"/>
-            </w:tcMar>
-            <w:vAlign w:val="center"/>
-          </w:tcPr>
-          <w:p>
-            <w:pPr>
-              <w:spacing w:after="0"/>
-            </w:pPr>
-            <w:r>
-              <w:rPr>
-                <w:b w:val="false"/>
-                <w:bCs w:val="false"/>
-                <w:sz w:val="18"/>
-                <w:szCs w:val="18"/>
-              </w:rPr>
-              <w:t xml:space="preserve">톈진 소재 제조사 F</w:t>
-            </w:r>
-          </w:p>
-        </w:tc>
-        <w:tc>
-          <w:tcPr>
-            <w:tcW w:type="dxa" w:w="3400"/>
-            <w:tcMar>
-              <w:top w:type="dxa" w:w="55"/>
-              <w:left w:type="dxa" w:w="95"/>
-              <w:bottom w:type="dxa" w:w="55"/>
-              <w:right w:type="dxa" w:w="95"/>
-            </w:tcMar>
-            <w:vAlign w:val="center"/>
-          </w:tcPr>
-          <w:p>
-            <w:pPr>
-              <w:spacing w:after="0"/>
-            </w:pPr>
-            <w:r>
-              <w:rPr>
-                <w:b w:val="false"/>
-                <w:bCs w:val="false"/>
-                <w:sz w:val="18"/>
-                <w:szCs w:val="18"/>
-              </w:rPr>
-              <w:t xml:space="preserve">대형 압출기 보유 표기, 대구경 단조관 취급</w:t>
-            </w:r>
-          </w:p>
-        </w:tc>
-        <w:tc>
-          <w:tcPr>
-            <w:tcW w:type="dxa" w:w="3406"/>
-            <w:tcMar>
-              <w:top w:type="dxa" w:w="55"/>
-              <w:left w:type="dxa" w:w="95"/>
-              <w:bottom w:type="dxa" w:w="55"/>
-              <w:right w:type="dxa" w:w="95"/>
-            </w:tcMar>
-            <w:vAlign w:val="center"/>
-          </w:tcPr>
-          <w:p>
-            <w:pPr>
-              <w:spacing w:after="0"/>
-            </w:pPr>
-            <w:r>
-              <w:rPr>
-                <w:b w:val="false"/>
-                <w:bCs w:val="false"/>
-                <w:sz w:val="18"/>
-                <w:szCs w:val="18"/>
-              </w:rPr>
-              <w:t xml:space="preserve">실제 프레스 용량, 성형 공법 확인</w:t>
+              <w:t xml:space="preserve">실제 프레스 용량, 성형 공법(압출/단조) 확인</w:t>
             </w:r>
           </w:p>
         </w:tc>
@@ -2911,7 +3191,813 @@
           <w:sz w:val="20"/>
           <w:szCs w:val="20"/>
         </w:rPr>
-        <w:t xml:space="preserve">4개사에 동일한 기술 사양과 확인 항목으로 견적 요청서를 발송하여, 회신 내용을 동일 기준으로 비교할 예정입니다. 회신 후 유력 업체에 대해서는 현장 방문을 진행하겠습니다.</w:t>
+        <w:t xml:space="preserve">3개사에 동일한 기술 사양과 확인 항목으로 견적 요청서를 발송하여, 회신 내용을 동일 기준으로 비교할 예정입니다. 회신 후 유력 업체에 대해서는 현장 방문을 진행하겠습니다.</w:t>
+      </w:r>
+    </w:p>
+    <w:p>
+      <w:pPr>
+        <w:spacing w:after="70"/>
+      </w:pPr>
+      <w:r>
+        <w:rPr>
+          <w:b/>
+          <w:bCs/>
+          <w:sz w:val="20"/>
+          <w:szCs w:val="20"/>
+        </w:rPr>
+        <w:t xml:space="preserve">국영 대형 알루미늄 기업 계열의 압출 전문 사업장에 대해서는 공식 경로를 통해 별도 접촉을 진행합니다. 사례 ③과 같이 유사 상호를 사용하는 민간 업체와 혼동하지 않도록, 법인 등록 정보를 먼저 확인한 후 접촉하겠습니다.</w:t>
+      </w:r>
+    </w:p>
+    <w:p>
+      <w:pPr>
+        <w:spacing w:after="70" w:before="190"/>
+      </w:pPr>
+      <w:r>
+        <w:rPr>
+          <w:b/>
+          <w:bCs/>
+          <w:color w:val="2E5878"/>
+          <w:sz w:val="21"/>
+          <w:szCs w:val="21"/>
+        </w:rPr>
+        <w:t xml:space="preserve">5-1. 대형 국영 제조사와 중견 민간 제조사의 선택 기준</w:t>
+      </w:r>
+    </w:p>
+    <w:p>
+      <w:pPr>
+        <w:spacing w:after="70"/>
+      </w:pPr>
+      <w:r>
+        <w:rPr>
+          <w:b w:val="false"/>
+          <w:bCs w:val="false"/>
+          <w:sz w:val="20"/>
+          <w:szCs w:val="20"/>
+        </w:rPr>
+        <w:t xml:space="preserve">설비만 놓고 보면 국영 대형 제조사가 가장 확실합니다. 대구경 장척관을 생산할 설비를 모두 갖추고 있어 기술적으로 못 만드는 규격이 거의 없습니다. 다만 실무적으로는 다음 제약이 있습니다.</w:t>
+      </w:r>
+    </w:p>
+    <w:tbl>
+      <w:tblPr>
+        <w:tblW w:type="dxa" w:w="9306"/>
+        <w:tblBorders>
+          <w:top w:val="single" w:color="auto" w:sz="4"/>
+          <w:left w:val="single" w:color="auto" w:sz="4"/>
+          <w:bottom w:val="single" w:color="auto" w:sz="4"/>
+          <w:right w:val="single" w:color="auto" w:sz="4"/>
+          <w:insideH w:val="single" w:color="auto" w:sz="4"/>
+          <w:insideV w:val="single" w:color="auto" w:sz="4"/>
+        </w:tblBorders>
+      </w:tblPr>
+      <w:tblGrid>
+        <w:gridCol w:w="2400"/>
+        <w:gridCol w:w="3400"/>
+        <w:gridCol w:w="3506"/>
+      </w:tblGrid>
+      <w:tr>
+        <w:tc>
+          <w:tcPr>
+            <w:tcW w:type="dxa" w:w="2400"/>
+            <w:shd w:fill="E4EEF1" w:val="clear"/>
+            <w:tcMar>
+              <w:top w:type="dxa" w:w="55"/>
+              <w:left w:type="dxa" w:w="95"/>
+              <w:bottom w:type="dxa" w:w="55"/>
+              <w:right w:type="dxa" w:w="95"/>
+            </w:tcMar>
+            <w:vAlign w:val="center"/>
+          </w:tcPr>
+          <w:p>
+            <w:pPr>
+              <w:spacing w:after="0"/>
+            </w:pPr>
+            <w:r>
+              <w:rPr>
+                <w:b/>
+                <w:bCs/>
+                <w:color w:val="2E5878"/>
+                <w:sz w:val="18"/>
+                <w:szCs w:val="18"/>
+              </w:rPr>
+              <w:t xml:space="preserve">구분</w:t>
+            </w:r>
+          </w:p>
+        </w:tc>
+        <w:tc>
+          <w:tcPr>
+            <w:tcW w:type="dxa" w:w="3400"/>
+            <w:shd w:fill="E4EEF1" w:val="clear"/>
+            <w:tcMar>
+              <w:top w:type="dxa" w:w="55"/>
+              <w:left w:type="dxa" w:w="95"/>
+              <w:bottom w:type="dxa" w:w="55"/>
+              <w:right w:type="dxa" w:w="95"/>
+            </w:tcMar>
+            <w:vAlign w:val="center"/>
+          </w:tcPr>
+          <w:p>
+            <w:pPr>
+              <w:spacing w:after="0"/>
+            </w:pPr>
+            <w:r>
+              <w:rPr>
+                <w:b/>
+                <w:bCs/>
+                <w:color w:val="2E5878"/>
+                <w:sz w:val="18"/>
+                <w:szCs w:val="18"/>
+              </w:rPr>
+              <w:t xml:space="preserve">대형 국영 제조사</w:t>
+            </w:r>
+          </w:p>
+        </w:tc>
+        <w:tc>
+          <w:tcPr>
+            <w:tcW w:type="dxa" w:w="3506"/>
+            <w:shd w:fill="E4EEF1" w:val="clear"/>
+            <w:tcMar>
+              <w:top w:type="dxa" w:w="55"/>
+              <w:left w:type="dxa" w:w="95"/>
+              <w:bottom w:type="dxa" w:w="55"/>
+              <w:right w:type="dxa" w:w="95"/>
+            </w:tcMar>
+            <w:vAlign w:val="center"/>
+          </w:tcPr>
+          <w:p>
+            <w:pPr>
+              <w:spacing w:after="0"/>
+            </w:pPr>
+            <w:r>
+              <w:rPr>
+                <w:b/>
+                <w:bCs/>
+                <w:color w:val="2E5878"/>
+                <w:sz w:val="18"/>
+                <w:szCs w:val="18"/>
+              </w:rPr>
+              <w:t xml:space="preserve">중견 민간 제조사</w:t>
+            </w:r>
+          </w:p>
+        </w:tc>
+      </w:tr>
+      <w:tr>
+        <w:tc>
+          <w:tcPr>
+            <w:tcW w:type="dxa" w:w="2400"/>
+            <w:tcMar>
+              <w:top w:type="dxa" w:w="55"/>
+              <w:left w:type="dxa" w:w="95"/>
+              <w:bottom w:type="dxa" w:w="55"/>
+              <w:right w:type="dxa" w:w="95"/>
+            </w:tcMar>
+            <w:vAlign w:val="center"/>
+          </w:tcPr>
+          <w:p>
+            <w:pPr>
+              <w:spacing w:after="0"/>
+            </w:pPr>
+            <w:r>
+              <w:rPr>
+                <w:b w:val="false"/>
+                <w:bCs w:val="false"/>
+                <w:sz w:val="18"/>
+                <w:szCs w:val="18"/>
+              </w:rPr>
+              <w:t xml:space="preserve">설비 대응력</w:t>
+            </w:r>
+          </w:p>
+        </w:tc>
+        <w:tc>
+          <w:tcPr>
+            <w:tcW w:type="dxa" w:w="3400"/>
+            <w:tcMar>
+              <w:top w:type="dxa" w:w="55"/>
+              <w:left w:type="dxa" w:w="95"/>
+              <w:bottom w:type="dxa" w:w="55"/>
+              <w:right w:type="dxa" w:w="95"/>
+            </w:tcMar>
+            <w:vAlign w:val="center"/>
+          </w:tcPr>
+          <w:p>
+            <w:pPr>
+              <w:spacing w:after="0"/>
+            </w:pPr>
+            <w:r>
+              <w:rPr>
+                <w:b w:val="false"/>
+                <w:bCs w:val="false"/>
+                <w:sz w:val="18"/>
+                <w:szCs w:val="18"/>
+              </w:rPr>
+              <w:t xml:space="preserve">거의 모든 규격 생산 가능</w:t>
+            </w:r>
+          </w:p>
+        </w:tc>
+        <w:tc>
+          <w:tcPr>
+            <w:tcW w:type="dxa" w:w="3506"/>
+            <w:tcMar>
+              <w:top w:type="dxa" w:w="55"/>
+              <w:left w:type="dxa" w:w="95"/>
+              <w:bottom w:type="dxa" w:w="55"/>
+              <w:right w:type="dxa" w:w="95"/>
+            </w:tcMar>
+            <w:vAlign w:val="center"/>
+          </w:tcPr>
+          <w:p>
+            <w:pPr>
+              <w:spacing w:after="0"/>
+            </w:pPr>
+            <w:r>
+              <w:rPr>
+                <w:b w:val="false"/>
+                <w:bCs w:val="false"/>
+                <w:sz w:val="18"/>
+                <w:szCs w:val="18"/>
+              </w:rPr>
+              <w:t xml:space="preserve">업체별 편차 — 개별 검증 필요</w:t>
+            </w:r>
+          </w:p>
+        </w:tc>
+      </w:tr>
+      <w:tr>
+        <w:tc>
+          <w:tcPr>
+            <w:tcW w:type="dxa" w:w="2400"/>
+            <w:tcMar>
+              <w:top w:type="dxa" w:w="55"/>
+              <w:left w:type="dxa" w:w="95"/>
+              <w:bottom w:type="dxa" w:w="55"/>
+              <w:right w:type="dxa" w:w="95"/>
+            </w:tcMar>
+            <w:vAlign w:val="center"/>
+          </w:tcPr>
+          <w:p>
+            <w:pPr>
+              <w:spacing w:after="0"/>
+            </w:pPr>
+            <w:r>
+              <w:rPr>
+                <w:b w:val="false"/>
+                <w:bCs w:val="false"/>
+                <w:sz w:val="18"/>
+                <w:szCs w:val="18"/>
+              </w:rPr>
+              <w:t xml:space="preserve">수주 기준</w:t>
+            </w:r>
+          </w:p>
+        </w:tc>
+        <w:tc>
+          <w:tcPr>
+            <w:tcW w:type="dxa" w:w="3400"/>
+            <w:tcMar>
+              <w:top w:type="dxa" w:w="55"/>
+              <w:left w:type="dxa" w:w="95"/>
+              <w:bottom w:type="dxa" w:w="55"/>
+              <w:right w:type="dxa" w:w="95"/>
+            </w:tcMar>
+            <w:vAlign w:val="center"/>
+          </w:tcPr>
+          <w:p>
+            <w:pPr>
+              <w:spacing w:after="0"/>
+            </w:pPr>
+            <w:r>
+              <w:rPr>
+                <w:b w:val="false"/>
+                <w:bCs w:val="false"/>
+                <w:sz w:val="18"/>
+                <w:szCs w:val="18"/>
+              </w:rPr>
+              <w:t xml:space="preserve">수량 우선 — 최소 물량 기준이 높음</w:t>
+            </w:r>
+          </w:p>
+        </w:tc>
+        <w:tc>
+          <w:tcPr>
+            <w:tcW w:type="dxa" w:w="3506"/>
+            <w:tcMar>
+              <w:top w:type="dxa" w:w="55"/>
+              <w:left w:type="dxa" w:w="95"/>
+              <w:bottom w:type="dxa" w:w="55"/>
+              <w:right w:type="dxa" w:w="95"/>
+            </w:tcMar>
+            <w:vAlign w:val="center"/>
+          </w:tcPr>
+          <w:p>
+            <w:pPr>
+              <w:spacing w:after="0"/>
+            </w:pPr>
+            <w:r>
+              <w:rPr>
+                <w:b w:val="false"/>
+                <w:bCs w:val="false"/>
+                <w:sz w:val="18"/>
+                <w:szCs w:val="18"/>
+              </w:rPr>
+              <w:t xml:space="preserve">소량·다품종 대응 가능</w:t>
+            </w:r>
+          </w:p>
+        </w:tc>
+      </w:tr>
+      <w:tr>
+        <w:tc>
+          <w:tcPr>
+            <w:tcW w:type="dxa" w:w="2400"/>
+            <w:tcMar>
+              <w:top w:type="dxa" w:w="55"/>
+              <w:left w:type="dxa" w:w="95"/>
+              <w:bottom w:type="dxa" w:w="55"/>
+              <w:right w:type="dxa" w:w="95"/>
+            </w:tcMar>
+            <w:vAlign w:val="center"/>
+          </w:tcPr>
+          <w:p>
+            <w:pPr>
+              <w:spacing w:after="0"/>
+            </w:pPr>
+            <w:r>
+              <w:rPr>
+                <w:b w:val="false"/>
+                <w:bCs w:val="false"/>
+                <w:sz w:val="18"/>
+                <w:szCs w:val="18"/>
+              </w:rPr>
+              <w:t xml:space="preserve">본 건 적합성</w:t>
+            </w:r>
+          </w:p>
+        </w:tc>
+        <w:tc>
+          <w:tcPr>
+            <w:tcW w:type="dxa" w:w="3400"/>
+            <w:tcMar>
+              <w:top w:type="dxa" w:w="55"/>
+              <w:left w:type="dxa" w:w="95"/>
+              <w:bottom w:type="dxa" w:w="55"/>
+              <w:right w:type="dxa" w:w="95"/>
+            </w:tcMar>
+            <w:vAlign w:val="center"/>
+          </w:tcPr>
+          <w:p>
+            <w:pPr>
+              <w:spacing w:after="0"/>
+            </w:pPr>
+            <w:r>
+              <w:rPr>
+                <w:b w:val="false"/>
+                <w:bCs w:val="false"/>
+                <w:sz w:val="18"/>
+                <w:szCs w:val="18"/>
+              </w:rPr>
+              <w:t xml:space="preserve">금회 물량(24본)은 기준 미달 가능성 높음</w:t>
+            </w:r>
+          </w:p>
+        </w:tc>
+        <w:tc>
+          <w:tcPr>
+            <w:tcW w:type="dxa" w:w="3506"/>
+            <w:tcMar>
+              <w:top w:type="dxa" w:w="55"/>
+              <w:left w:type="dxa" w:w="95"/>
+              <w:bottom w:type="dxa" w:w="55"/>
+              <w:right w:type="dxa" w:w="95"/>
+            </w:tcMar>
+            <w:vAlign w:val="center"/>
+          </w:tcPr>
+          <w:p>
+            <w:pPr>
+              <w:spacing w:after="0"/>
+            </w:pPr>
+            <w:r>
+              <w:rPr>
+                <w:b w:val="false"/>
+                <w:bCs w:val="false"/>
+                <w:sz w:val="18"/>
+                <w:szCs w:val="18"/>
+              </w:rPr>
+              <w:t xml:space="preserve">금회 물량 수준에 적합</w:t>
+            </w:r>
+          </w:p>
+        </w:tc>
+      </w:tr>
+      <w:tr>
+        <w:tc>
+          <w:tcPr>
+            <w:tcW w:type="dxa" w:w="2400"/>
+            <w:tcMar>
+              <w:top w:type="dxa" w:w="55"/>
+              <w:left w:type="dxa" w:w="95"/>
+              <w:bottom w:type="dxa" w:w="55"/>
+              <w:right w:type="dxa" w:w="95"/>
+            </w:tcMar>
+            <w:vAlign w:val="center"/>
+          </w:tcPr>
+          <w:p>
+            <w:pPr>
+              <w:spacing w:after="0"/>
+            </w:pPr>
+            <w:r>
+              <w:rPr>
+                <w:b w:val="false"/>
+                <w:bCs w:val="false"/>
+                <w:sz w:val="18"/>
+                <w:szCs w:val="18"/>
+              </w:rPr>
+              <w:t xml:space="preserve">납기</w:t>
+            </w:r>
+          </w:p>
+        </w:tc>
+        <w:tc>
+          <w:tcPr>
+            <w:tcW w:type="dxa" w:w="3400"/>
+            <w:tcMar>
+              <w:top w:type="dxa" w:w="55"/>
+              <w:left w:type="dxa" w:w="95"/>
+              <w:bottom w:type="dxa" w:w="55"/>
+              <w:right w:type="dxa" w:w="95"/>
+            </w:tcMar>
+            <w:vAlign w:val="center"/>
+          </w:tcPr>
+          <w:p>
+            <w:pPr>
+              <w:spacing w:after="0"/>
+            </w:pPr>
+            <w:r>
+              <w:rPr>
+                <w:b w:val="false"/>
+                <w:bCs w:val="false"/>
+                <w:sz w:val="18"/>
+                <w:szCs w:val="18"/>
+              </w:rPr>
+              <w:t xml:space="preserve">길어짐 (생산 계획 편성 순위 후순위)</w:t>
+            </w:r>
+          </w:p>
+        </w:tc>
+        <w:tc>
+          <w:tcPr>
+            <w:tcW w:type="dxa" w:w="3506"/>
+            <w:tcMar>
+              <w:top w:type="dxa" w:w="55"/>
+              <w:left w:type="dxa" w:w="95"/>
+              <w:bottom w:type="dxa" w:w="55"/>
+              <w:right w:type="dxa" w:w="95"/>
+            </w:tcMar>
+            <w:vAlign w:val="center"/>
+          </w:tcPr>
+          <w:p>
+            <w:pPr>
+              <w:spacing w:after="0"/>
+            </w:pPr>
+            <w:r>
+              <w:rPr>
+                <w:b w:val="false"/>
+                <w:bCs w:val="false"/>
+                <w:sz w:val="18"/>
+                <w:szCs w:val="18"/>
+              </w:rPr>
+              <w:t xml:space="preserve">상대적으로 짧음</w:t>
+            </w:r>
+          </w:p>
+        </w:tc>
+      </w:tr>
+    </w:tbl>
+    <w:p>
+      <w:pPr>
+        <w:spacing w:after="70"/>
+      </w:pPr>
+      <w:r>
+        <w:rPr>
+          <w:b w:val="false"/>
+          <w:bCs w:val="false"/>
+          <w:sz w:val="20"/>
+          <w:szCs w:val="20"/>
+        </w:rPr>
+        <w:t xml:space="preserve"/>
+      </w:r>
+    </w:p>
+    <w:p>
+      <w:pPr>
+        <w:pBdr>
+          <w:top w:val="single" w:color="5A9A96" w:sz="4"/>
+          <w:left w:val="single" w:color="5A9A96" w:sz="24"/>
+        </w:pBdr>
+        <w:shd w:fill="EAF2F4" w:val="clear"/>
+        <w:spacing w:after="0" w:before="80"/>
+        <w:ind w:left="160" w:right="160"/>
+      </w:pPr>
+      <w:r>
+        <w:rPr>
+          <w:b/>
+          <w:bCs/>
+          <w:color w:val="1F3D4A"/>
+          <w:sz w:val="20"/>
+          <w:szCs w:val="20"/>
+        </w:rPr>
+        <w:t xml:space="preserve">선정 방향</w:t>
+      </w:r>
+    </w:p>
+    <w:p>
+      <w:pPr>
+        <w:pBdr>
+          <w:bottom w:val="single" w:color="5A9A96" w:sz="4"/>
+          <w:left w:val="single" w:color="5A9A96" w:sz="24"/>
+        </w:pBdr>
+        <w:shd w:fill="EAF2F4" w:val="clear"/>
+        <w:spacing w:after="120" w:before="30"/>
+        <w:ind w:left="160" w:right="160"/>
+      </w:pPr>
+      <w:r>
+        <w:rPr>
+          <w:color w:val="203038"/>
+          <w:sz w:val="19"/>
+          <w:szCs w:val="19"/>
+        </w:rPr>
+        <w:t xml:space="preserve">국영 대형 제조사는 설비 확인이 필요 없는 대신 소량 수주 자체가 성사되기 어렵고 납기가 길어집니다. 따라서 당사는 검증 역량을 실제 생산설비를 보유한 중견 제조사에 집중하되, 국영 제조사에는 소량 수주 가능 여부와 연간 계약 형태의 수용 가능성을 병행 문의하는 방식으로 진행하고 있습니다.</w:t>
+      </w:r>
+    </w:p>
+    <w:p>
+      <w:pPr>
+        <w:spacing w:after="70" w:before="190"/>
+      </w:pPr>
+      <w:r>
+        <w:rPr>
+          <w:b/>
+          <w:bCs/>
+          <w:color w:val="2E5878"/>
+          <w:sz w:val="21"/>
+          <w:szCs w:val="21"/>
+        </w:rPr>
+        <w:t xml:space="preserve">5-2. 중견 제조사가 본 건에 적합한 이유</w:t>
+      </w:r>
+    </w:p>
+    <w:p>
+      <w:pPr>
+        <w:spacing w:after="70"/>
+      </w:pPr>
+      <w:r>
+        <w:rPr>
+          <w:b w:val="false"/>
+          <w:bCs w:val="false"/>
+          <w:sz w:val="20"/>
+          <w:szCs w:val="20"/>
+        </w:rPr>
+        <w:t xml:space="preserve">검토 과정에서 확인한 바로는, 실제 생산설비를 보유한 중견 제조사가 본 건과 같은 소량·정밀 사양 건에 가장 현실적인 파트너입니다. 중개업체와 구별되는 특징이 세 가지 있습니다.</w:t>
+      </w:r>
+    </w:p>
+    <w:p>
+      <w:pPr>
+        <w:pStyle w:val="ListParagraph"/>
+        <w:numPr>
+          <w:ilvl w:val="0"/>
+          <w:numId w:val="4"/>
+        </w:numPr>
+        <w:spacing w:after="55"/>
+      </w:pPr>
+      <w:r>
+        <w:rPr>
+          <w:b/>
+          <w:bCs/>
+          <w:sz w:val="20"/>
+          <w:szCs w:val="20"/>
+        </w:rPr>
+        <w:t xml:space="preserve">가능 여부를 즉시 회신합니다. 자사 설비 한계를 정확히 알고 있어 불가능한 사양에는 불가능하다고 답합니다. 판단이 빨라 검토 기간이 단축되며, 이 답변 자체가 실체를 확인하는 근거가 됩니다.</w:t>
+      </w:r>
+    </w:p>
+    <w:p>
+      <w:pPr>
+        <w:pStyle w:val="ListParagraph"/>
+        <w:numPr>
+          <w:ilvl w:val="0"/>
+          <w:numId w:val="4"/>
+        </w:numPr>
+        <w:spacing w:after="55"/>
+      </w:pPr>
+      <w:r>
+        <w:rPr>
+          <w:b w:val="false"/>
+          <w:bCs w:val="false"/>
+          <w:sz w:val="20"/>
+          <w:szCs w:val="20"/>
+        </w:rPr>
+        <w:t xml:space="preserve">동종 업계 네트워크를 통해 위탁생산(OEM)을 주선할 수 있습니다. 자사 설비를 초과하는 규격은 거래 관계에 있는 대형 공장에 위탁하는 방식으로 대응하며, 이 경우 대형 공장이 직접 수주하지 않는 소량도 성사될 수 있습니다.</w:t>
+      </w:r>
+    </w:p>
+    <w:p>
+      <w:pPr>
+        <w:pStyle w:val="ListParagraph"/>
+        <w:numPr>
+          <w:ilvl w:val="0"/>
+          <w:numId w:val="4"/>
+        </w:numPr>
+        <w:spacing w:after="55"/>
+      </w:pPr>
+      <w:r>
+        <w:rPr>
+          <w:b w:val="false"/>
+          <w:bCs w:val="false"/>
+          <w:sz w:val="20"/>
+          <w:szCs w:val="20"/>
+        </w:rPr>
+        <w:t xml:space="preserve">원소재를 유리한 조건으로 확보해 두고 가공비 중심으로 견적하는 경우가 있습니다. 이 구조에서는 원소재 시세 변동의 영향이 작아 가격이 안정적이며, 견적 근거를 분해해서 제시할 수 있습니다.</w:t>
+      </w:r>
+    </w:p>
+    <w:p>
+      <w:pPr>
+        <w:spacing w:after="70"/>
+      </w:pPr>
+      <w:r>
+        <w:rPr>
+          <w:b w:val="false"/>
+          <w:bCs w:val="false"/>
+          <w:sz w:val="20"/>
+          <w:szCs w:val="20"/>
+        </w:rPr>
+        <w:t xml:space="preserve"/>
+      </w:r>
+    </w:p>
+    <w:p>
+      <w:pPr>
+        <w:pBdr>
+          <w:top w:val="single" w:color="5A9A96" w:sz="4"/>
+          <w:left w:val="single" w:color="5A9A96" w:sz="24"/>
+        </w:pBdr>
+        <w:shd w:fill="EAF2F4" w:val="clear"/>
+        <w:spacing w:after="0" w:before="80"/>
+        <w:ind w:left="160" w:right="160"/>
+      </w:pPr>
+      <w:r>
+        <w:rPr>
+          <w:b/>
+          <w:bCs/>
+          <w:color w:val="1F3D4A"/>
+          <w:sz w:val="20"/>
+          <w:szCs w:val="20"/>
+        </w:rPr>
+        <w:t xml:space="preserve">위탁생산(OEM)에 대한 당사의 판단 기준</w:t>
+      </w:r>
+    </w:p>
+    <w:p>
+      <w:pPr>
+        <w:pBdr>
+          <w:bottom w:val="single" w:color="5A9A96" w:sz="4"/>
+          <w:left w:val="single" w:color="5A9A96" w:sz="24"/>
+        </w:pBdr>
+        <w:shd w:fill="EAF2F4" w:val="clear"/>
+        <w:spacing w:after="120" w:before="30"/>
+        <w:ind w:left="160" w:right="160"/>
+      </w:pPr>
+      <w:r>
+        <w:rPr>
+          <w:color w:val="203038"/>
+          <w:sz w:val="19"/>
+          <w:szCs w:val="19"/>
+        </w:rPr>
+        <w:t xml:space="preserve">위탁생산 자체는 중국 알루미늄 업계의 일반적인 거래 형태이며, 그 자체를 결격 사유로 보지 않습니다. 오히려 소량 발주가 성사되려면 이 방식이 필요한 경우가 많습니다. 다만 당사는 다음 두 가지를 조건으로 합니다. 첫째, 실제 생산 공장의 상호·소재지·설비를 공개할 것. 둘째, 귀사와 당사의 현장 실사를 수용할 것. 이 두 조건이 충족되면 위탁생산 구조라도 품질과 책임 소재를 관리할 수 있으며, 충족되지 않으면 중개업체와 실질적으로 동일한 위험을 안게 됩니다.</w:t>
+      </w:r>
+    </w:p>
+    <w:p>
+      <w:pPr>
+        <w:pStyle w:val="Heading1"/>
+        <w:pBdr>
+          <w:bottom w:val="single" w:color="5A9A96" w:sz="4"/>
+        </w:pBdr>
+        <w:spacing w:after="120" w:before="300"/>
+      </w:pPr>
+      <w:r>
+        <w:rPr>
+          <w:b/>
+          <w:bCs/>
+          <w:color w:val="2E5878"/>
+          <w:sz w:val="24"/>
+          <w:szCs w:val="24"/>
+        </w:rPr>
+        <w:t xml:space="preserve">6. 대금·납기 리스크와 대응 방안</w:t>
+      </w:r>
+    </w:p>
+    <w:p>
+      <w:pPr>
+        <w:spacing w:after="70"/>
+      </w:pPr>
+      <w:r>
+        <w:rPr>
+          <w:b w:val="false"/>
+          <w:bCs w:val="false"/>
+          <w:sz w:val="20"/>
+          <w:szCs w:val="20"/>
+        </w:rPr>
+        <w:t xml:space="preserve">공급사 실체 확인과 별개로, 중국 알루미늄 거래에서 반복적으로 보고되는 계약 이행 단계의 위험이 있습니다.</w:t>
+      </w:r>
+    </w:p>
+    <w:p>
+      <w:pPr>
+        <w:pBdr>
+          <w:top w:val="single" w:color="B03030" w:sz="4"/>
+          <w:bottom w:val="single" w:color="B03030" w:sz="4"/>
+          <w:left w:val="single" w:color="B03030" w:sz="24"/>
+        </w:pBdr>
+        <w:shd w:fill="FDECEA" w:val="clear"/>
+        <w:spacing w:after="120" w:before="80"/>
+        <w:ind w:left="160" w:right="160"/>
+      </w:pPr>
+      <w:r>
+        <w:rPr>
+          <w:b/>
+          <w:bCs/>
+          <w:color w:val="3A2020"/>
+          <w:sz w:val="19"/>
+          <w:szCs w:val="19"/>
+        </w:rPr>
+        <w:t xml:space="preserve">중개업체의 전형적 위험: 선금(통상 30%)을 먼저 수취한 뒤, 알루미늄 선물 시세가 상승하면 선적을 지연시키거나 단가 인상을 요구하는 사례가 다수 보고됩니다. 자체 생산설비가 없는 중개업체는 원소재를 시세에 따라 조달해야 하므로, 시세가 오르면 당초 견적을 이행할수록 손실이 발생하는 구조이기 때문입니다.</w:t>
+      </w:r>
+    </w:p>
+    <w:p>
+      <w:pPr>
+        <w:spacing w:after="70"/>
+      </w:pPr>
+      <w:r>
+        <w:rPr>
+          <w:b w:val="false"/>
+          <w:bCs w:val="false"/>
+          <w:sz w:val="20"/>
+          <w:szCs w:val="20"/>
+        </w:rPr>
+        <w:t xml:space="preserve">이 위험은 공급사를 잘 고르는 것만으로는 제거되지 않으며, 계약 조건으로 차단해야 합니다. 당사는 발주 시 다음 조건을 적용할 계획입니다.</w:t>
+      </w:r>
+    </w:p>
+    <w:p>
+      <w:pPr>
+        <w:pStyle w:val="ListParagraph"/>
+        <w:numPr>
+          <w:ilvl w:val="0"/>
+          <w:numId w:val="5"/>
+        </w:numPr>
+        <w:spacing w:after="55"/>
+      </w:pPr>
+      <w:r>
+        <w:rPr>
+          <w:b/>
+          <w:bCs/>
+          <w:sz w:val="20"/>
+          <w:szCs w:val="20"/>
+        </w:rPr>
+        <w:t xml:space="preserve">가격 구조 분해 요구: 총액이 아닌 "원소재 시세 + 가공비(kg당)" 형태로 견적을 요구합니다. 실제 제조사는 자사 가공비를 정확히 알고 있어 즉시 분해가 가능하나, 중개업체는 이를 제시하지 못합니다. 실체 검증과 가격 안정성 확보를 동시에 달성하는 방법입니다.</w:t>
+      </w:r>
+    </w:p>
+    <w:p>
+      <w:pPr>
+        <w:pStyle w:val="ListParagraph"/>
+        <w:numPr>
+          <w:ilvl w:val="0"/>
+          <w:numId w:val="5"/>
+        </w:numPr>
+        <w:spacing w:after="55"/>
+      </w:pPr>
+      <w:r>
+        <w:rPr>
+          <w:b w:val="false"/>
+          <w:bCs w:val="false"/>
+          <w:sz w:val="20"/>
+          <w:szCs w:val="20"/>
+        </w:rPr>
+        <w:t xml:space="preserve">선금 비율 축소 또는 신용장 활용: 초도 거래는 선금 비율을 낮추거나, 신용장(L/C) 조건으로 선적 서류와 대금을 연동시켜 선금 회수 불능 위험을 차단합니다.</w:t>
+      </w:r>
+    </w:p>
+    <w:p>
+      <w:pPr>
+        <w:pStyle w:val="ListParagraph"/>
+        <w:numPr>
+          <w:ilvl w:val="0"/>
+          <w:numId w:val="5"/>
+        </w:numPr>
+        <w:spacing w:after="55"/>
+      </w:pPr>
+      <w:r>
+        <w:rPr>
+          <w:b w:val="false"/>
+          <w:bCs w:val="false"/>
+          <w:sz w:val="20"/>
+          <w:szCs w:val="20"/>
+        </w:rPr>
+        <w:t xml:space="preserve">선적 기한 명시: 계약서에 선적 기한과 지연 시 조치를 명문화하여, 시세 변동을 이유로 한 무기한 지연을 방지합니다.</w:t>
+      </w:r>
+    </w:p>
+    <w:p>
+      <w:pPr>
+        <w:pStyle w:val="ListParagraph"/>
+        <w:numPr>
+          <w:ilvl w:val="0"/>
+          <w:numId w:val="5"/>
+        </w:numPr>
+        <w:spacing w:after="55"/>
+      </w:pPr>
+      <w:r>
+        <w:rPr>
+          <w:b w:val="false"/>
+          <w:bCs w:val="false"/>
+          <w:sz w:val="20"/>
+          <w:szCs w:val="20"/>
+        </w:rPr>
+        <w:t xml:space="preserve">견적 유효기간 내 신속 확정: 현재 접수되는 견적의 유효기간은 5~7일로 짧습니다. 사양이 확정되는 즉시 결정할 수 있도록 사전에 판단 기준을 정해 두겠습니다.</w:t>
       </w:r>
     </w:p>
     <w:p>
@@ -3264,7 +4350,7 @@
           <w:sz w:val="24"/>
           <w:szCs w:val="24"/>
         </w:rPr>
-        <w:t xml:space="preserve">6. 요청 사항</w:t>
+        <w:t xml:space="preserve">7. 요청 사항</w:t>
       </w:r>
     </w:p>
     <w:p>
@@ -3412,7 +4498,7 @@
           <w:sz w:val="24"/>
           <w:szCs w:val="24"/>
         </w:rPr>
-        <w:t xml:space="preserve">7. 추가 제안</w:t>
+        <w:t xml:space="preserve">8. 추가 제안</w:t>
       </w:r>
     </w:p>
     <w:p>
@@ -4299,6 +5385,30 @@
       </w:pPr>
     </w:lvl>
   </w:abstractNum>
+  <w:abstractNum w:abstractNumId="5" w15:restartNumberingAfterBreak="0">
+    <w:multiLevelType w:val="hybridMultilevel"/>
+    <w:lvl w:ilvl="0" w15:tentative="1">
+      <w:start w:val="1"/>
+      <w:numFmt w:val="decimal"/>
+      <w:lvlText w:val="%1."/>
+      <w:lvlJc w:val="start"/>
+      <w:pPr>
+        <w:ind w:left="620" w:hanging="330"/>
+      </w:pPr>
+    </w:lvl>
+  </w:abstractNum>
+  <w:abstractNum w:abstractNumId="6" w15:restartNumberingAfterBreak="0">
+    <w:multiLevelType w:val="hybridMultilevel"/>
+    <w:lvl w:ilvl="0" w15:tentative="1">
+      <w:start w:val="1"/>
+      <w:numFmt w:val="decimal"/>
+      <w:lvlText w:val="%1."/>
+      <w:lvlJc w:val="start"/>
+      <w:pPr>
+        <w:ind w:left="620" w:hanging="330"/>
+      </w:pPr>
+    </w:lvl>
+  </w:abstractNum>
   <w:num w:numId="1">
     <w:abstractNumId w:val="1"/>
     <w:lvlOverride w:ilvl="0">
@@ -4313,6 +5423,18 @@
   </w:num>
   <w:num w:numId="3">
     <w:abstractNumId w:val="3"/>
+    <w:lvlOverride w:ilvl="0">
+      <w:startOverride w:val="1"/>
+    </w:lvlOverride>
+  </w:num>
+  <w:num w:numId="4">
+    <w:abstractNumId w:val="5"/>
+    <w:lvlOverride w:ilvl="0">
+      <w:startOverride w:val="1"/>
+    </w:lvlOverride>
+  </w:num>
+  <w:num w:numId="5">
+    <w:abstractNumId w:val="4"/>
     <w:lvlOverride w:ilvl="0">
       <w:startOverride w:val="1"/>
     </w:lvlOverride>

</xml_diff>

<commit_message>
Replace cost-breakdown approach with fixed-price clause and equipment questions
Co-Authored-By: Claude Fable 5 <noreply@anthropic.com>
Claude-Session: https://claude.ai/code/session_01D8V4YsNDSgybhuKSqPBmt4
</commit_message>
<xml_diff>
--- a/docs/shandong-botong/JSTech_Sourcing_Progress_Report.docx
+++ b/docs/shandong-botong/JSTech_Sourcing_Progress_Report.docx
@@ -3940,7 +3940,7 @@
           <w:sz w:val="20"/>
           <w:szCs w:val="20"/>
         </w:rPr>
-        <w:t xml:space="preserve">가격 구조 분해 요구: 총액이 아닌 "원소재 시세 + 가공비(kg당)" 형태로 견적을 요구합니다. 실제 제조사는 자사 가공비를 정확히 알고 있어 즉시 분해가 가능하나, 중개업체는 이를 제시하지 못합니다. 실체 검증과 가격 안정성 확보를 동시에 달성하는 방법입니다.</w:t>
+        <w:t xml:space="preserve">확정가 조항 명문화: 계약서 및 P/I에 "단가는 확정가이며 원자재 시세 변동을 이유로 조정하지 않는다"는 조항을 삽입합니다. 이 조항의 수용 여부 자체가 판단 근거가 됩니다. 정상적인 제조사는 자사 원가 구조가 확정되어 있어 수용에 문제가 없으나, 시세 연동을 전제로 견적한 업체는 이 조항을 회피합니다.</w:t>
       </w:r>
     </w:p>
     <w:p>
@@ -3978,7 +3978,7 @@
           <w:sz w:val="20"/>
           <w:szCs w:val="20"/>
         </w:rPr>
-        <w:t xml:space="preserve">선적 기한 명시: 계약서에 선적 기한과 지연 시 조치를 명문화하여, 시세 변동을 이유로 한 무기한 지연을 방지합니다.</w:t>
+        <w:t xml:space="preserve">선적 기한 및 지연 조항 명시: 계약서에 선적 기한과 지연 시 조치를 명문화하여, 시세 변동을 이유로 한 무기한 지연을 방지합니다.</w:t>
       </w:r>
     </w:p>
     <w:p>
@@ -3998,6 +3998,144 @@
           <w:szCs w:val="20"/>
         </w:rPr>
         <w:t xml:space="preserve">견적 유효기간 내 신속 확정: 현재 접수되는 견적의 유효기간은 5~7일로 짧습니다. 사양이 확정되는 즉시 결정할 수 있도록 사전에 판단 기준을 정해 두겠습니다.</w:t>
+      </w:r>
+    </w:p>
+    <w:p>
+      <w:pPr>
+        <w:spacing w:after="70"/>
+      </w:pPr>
+      <w:r>
+        <w:rPr>
+          <w:b w:val="false"/>
+          <w:bCs w:val="false"/>
+          <w:sz w:val="20"/>
+          <w:szCs w:val="20"/>
+        </w:rPr>
+        <w:t xml:space="preserve"/>
+      </w:r>
+    </w:p>
+    <w:p>
+      <w:pPr>
+        <w:spacing w:after="70" w:before="190"/>
+      </w:pPr>
+      <w:r>
+        <w:rPr>
+          <w:b/>
+          <w:bCs/>
+          <w:color w:val="2E5878"/>
+          <w:sz w:val="21"/>
+          <w:szCs w:val="21"/>
+        </w:rPr>
+        <w:t xml:space="preserve">6-1. 실체 확인을 위한 기술 질의</w:t>
+      </w:r>
+    </w:p>
+    <w:p>
+      <w:pPr>
+        <w:spacing w:after="70"/>
+      </w:pPr>
+      <w:r>
+        <w:rPr>
+          <w:b w:val="false"/>
+          <w:bCs w:val="false"/>
+          <w:sz w:val="20"/>
+          <w:szCs w:val="20"/>
+        </w:rPr>
+        <w:t xml:space="preserve">공급사의 실제 생산 능력은 가격 관련 질의보다 설비에 관한 기술 질의로 훨씬 정확하게 판별됩니다. 실제 제조사는 자사 설비 제원을 즉시 답변하나, 중개업체는 확인 후 회신하겠다고 답하거나 답변이 지연됩니다. 당사는 다음 항목을 공통 질의로 사용합니다.</w:t>
+      </w:r>
+    </w:p>
+    <w:p>
+      <w:pPr>
+        <w:pStyle w:val="ListParagraph"/>
+        <w:numPr>
+          <w:ilvl w:val="0"/>
+          <w:numId w:val="6"/>
+        </w:numPr>
+        <w:spacing w:after="55"/>
+      </w:pPr>
+      <w:r>
+        <w:rPr>
+          <w:b/>
+          <w:bCs/>
+          <w:sz w:val="20"/>
+          <w:szCs w:val="20"/>
+        </w:rPr>
+        <w:t xml:space="preserve">열처리로 및 담금질조의 유효 길이 — 6061-T6는 고용화 처리·담금질·시효 처리를 거쳐야 하므로, 압출기 용량과 무관하게 열처리 설비가 3,000mm를 수용하지 못하면 T6 상태 납품이 불가능합니다. 중소 규모 공장에서 흔히 발생하는 제약입니다.</w:t>
+      </w:r>
+    </w:p>
+    <w:p>
+      <w:pPr>
+        <w:pStyle w:val="ListParagraph"/>
+        <w:numPr>
+          <w:ilvl w:val="0"/>
+          <w:numId w:val="6"/>
+        </w:numPr>
+        <w:spacing w:after="55"/>
+      </w:pPr>
+      <w:r>
+        <w:rPr>
+          <w:b w:val="false"/>
+          <w:bCs w:val="false"/>
+          <w:sz w:val="20"/>
+          <w:szCs w:val="20"/>
+        </w:rPr>
+        <w:t xml:space="preserve">해당 규격 생산에 사용하는 압출기 톤수 및 압출통(container) 내경</w:t>
+      </w:r>
+    </w:p>
+    <w:p>
+      <w:pPr>
+        <w:pStyle w:val="ListParagraph"/>
+        <w:numPr>
+          <w:ilvl w:val="0"/>
+          <w:numId w:val="6"/>
+        </w:numPr>
+        <w:spacing w:after="55"/>
+      </w:pPr>
+      <w:r>
+        <w:rPr>
+          <w:b w:val="false"/>
+          <w:bCs w:val="false"/>
+          <w:sz w:val="20"/>
+          <w:szCs w:val="20"/>
+        </w:rPr>
+        <w:t xml:space="preserve">사용 빌렛 규격(직경 × 길이) 및 압출비</w:t>
+      </w:r>
+    </w:p>
+    <w:p>
+      <w:pPr>
+        <w:pStyle w:val="ListParagraph"/>
+        <w:numPr>
+          <w:ilvl w:val="0"/>
+          <w:numId w:val="6"/>
+        </w:numPr>
+        <w:spacing w:after="55"/>
+      </w:pPr>
+      <w:r>
+        <w:rPr>
+          <w:b w:val="false"/>
+          <w:bCs w:val="false"/>
+          <w:sz w:val="20"/>
+          <w:szCs w:val="20"/>
+        </w:rPr>
+        <w:t xml:space="preserve">인장시험기·경도계 등 시험 설비 자체 보유 여부 (외부 시험 의뢰 시 성적서 발급 주체 확인)</w:t>
+      </w:r>
+    </w:p>
+    <w:p>
+      <w:pPr>
+        <w:pStyle w:val="ListParagraph"/>
+        <w:numPr>
+          <w:ilvl w:val="0"/>
+          <w:numId w:val="6"/>
+        </w:numPr>
+        <w:spacing w:after="55"/>
+      </w:pPr>
+      <w:r>
+        <w:rPr>
+          <w:b w:val="false"/>
+          <w:bCs w:val="false"/>
+          <w:sz w:val="20"/>
+          <w:szCs w:val="20"/>
+        </w:rPr>
+        <w:t xml:space="preserve">공정별 소요 일수 내역 — 빌렛 준비, 압출, 열처리, 교정, 절단, 검사 단계별 일수</w:t>
       </w:r>
     </w:p>
     <w:p>
@@ -5409,6 +5547,18 @@
       </w:pPr>
     </w:lvl>
   </w:abstractNum>
+  <w:abstractNum w:abstractNumId="7" w15:restartNumberingAfterBreak="0">
+    <w:multiLevelType w:val="hybridMultilevel"/>
+    <w:lvl w:ilvl="0" w15:tentative="1">
+      <w:start w:val="1"/>
+      <w:numFmt w:val="decimal"/>
+      <w:lvlText w:val="%1."/>
+      <w:lvlJc w:val="start"/>
+      <w:pPr>
+        <w:ind w:left="620" w:hanging="330"/>
+      </w:pPr>
+    </w:lvl>
+  </w:abstractNum>
   <w:num w:numId="1">
     <w:abstractNumId w:val="1"/>
     <w:lvlOverride w:ilvl="0">
@@ -5435,6 +5585,12 @@
   </w:num>
   <w:num w:numId="5">
     <w:abstractNumId w:val="4"/>
+    <w:lvlOverride w:ilvl="0">
+      <w:startOverride w:val="1"/>
+    </w:lvlOverride>
+  </w:num>
+  <w:num w:numId="6">
+    <w:abstractNumId w:val="6"/>
     <w:lvlOverride w:ilvl="0">
       <w:startOverride w:val="1"/>
     </w:lvlOverride>

</xml_diff>

<commit_message>
Reframe customer report as feasibility-phase study; remove all pricing data
Co-Authored-By: Claude Fable 5 <noreply@anthropic.com>
Claude-Session: https://claude.ai/code/session_01D8V4YsNDSgybhuKSqPBmt4
</commit_message>
<xml_diff>
--- a/docs/shandong-botong/JSTech_Sourcing_Progress_Report.docx
+++ b/docs/shandong-botong/JSTech_Sourcing_Progress_Report.docx
@@ -32,7 +32,7 @@
           <w:sz w:val="20"/>
           <w:szCs w:val="20"/>
         </w:rPr>
-        <w:t xml:space="preserve">㈜제이에스텍 · 쿨링롤 원소재 (6061-T6) · DOHO CO., LTD. · 2026-08-12</w:t>
+        <w:t xml:space="preserve">㈜제이에스텍 · 쿨링롤 원소재 (6061-T6) · 시장 조사 및 공급사 실체 검증 단계 · DOHO CO., LTD. · 2026-08-12</w:t>
       </w:r>
     </w:p>
     <w:p>
@@ -96,7 +96,7 @@
     </w:p>
     <w:p>
       <w:pPr>
-        <w:spacing w:after="40"/>
+        <w:spacing w:after="70"/>
       </w:pPr>
       <w:r>
         <w:rPr>
@@ -106,6 +106,46 @@
           <w:szCs w:val="20"/>
         </w:rPr>
         <w:t xml:space="preserve">본 보고서는 지금까지의 검토 경과, 세 건의 실체 검증에서 확인한 사실, 대구경 스펙이 요구하는 기술적 조건, 그리고 대금·납기 관련 위험과 대응 방안을 정리한 것입니다.</w:t>
+      </w:r>
+    </w:p>
+    <w:p>
+      <w:pPr>
+        <w:pBdr>
+          <w:top w:val="single" w:color="5A9A96" w:sz="4"/>
+          <w:left w:val="single" w:color="5A9A96" w:sz="24"/>
+        </w:pBdr>
+        <w:shd w:fill="EAF2F4" w:val="clear"/>
+        <w:spacing w:after="0" w:before="80"/>
+        <w:ind w:left="160" w:right="160"/>
+      </w:pPr>
+      <w:r>
+        <w:rPr>
+          <w:b/>
+          <w:bCs/>
+          <w:color w:val="1F3D4A"/>
+          <w:sz w:val="20"/>
+          <w:szCs w:val="20"/>
+        </w:rPr>
+        <w:t xml:space="preserve">본 보고의 단계 — 가격 협의 이전</w:t>
+      </w:r>
+    </w:p>
+    <w:p>
+      <w:pPr>
+        <w:pBdr>
+          <w:bottom w:val="single" w:color="5A9A96" w:sz="4"/>
+          <w:left w:val="single" w:color="5A9A96" w:sz="24"/>
+        </w:pBdr>
+        <w:shd w:fill="EAF2F4" w:val="clear"/>
+        <w:spacing w:after="120" w:before="30"/>
+        <w:ind w:left="160" w:right="160"/>
+      </w:pPr>
+      <w:r>
+        <w:rPr>
+          <w:color w:val="203038"/>
+          <w:sz w:val="19"/>
+          <w:szCs w:val="19"/>
+        </w:rPr>
+        <w:t xml:space="preserve">중국 알루미늄 시장은 실제 제조사와 중개업체가 동일한 형태의 자료를 제출하므로, 생산 주체를 특정하는 것 자체가 상당한 검증을 요구합니다. 본 보고는 시장 조사 및 공급사 실체 검증 단계의 결과이며, 가격 조건은 포함하지 않습니다. 실제 생산 가능한 제조사가 확정되지 않은 상태에서의 견적은 이행 근거가 없어 의미가 없기 때문입니다. 제조사 확정과 현장 실사가 완료된 후 가격 협의 및 조건 협상 단계로 넘어가며, 그 시점에 별도 보고드리겠습니다.</w:t>
       </w:r>
     </w:p>
     <w:p>
@@ -876,7 +916,7 @@
                 <w:sz w:val="18"/>
                 <w:szCs w:val="18"/>
               </w:rPr>
-              <w:t xml:space="preserve">검토 업체 중 최저가 — 기존 조달가 대비 약 18% 낮은 금액</w:t>
+              <w:t xml:space="preserve">검토 업체 중 최저가 수준</w:t>
             </w:r>
           </w:p>
         </w:tc>
@@ -1290,7 +1330,7 @@
                 <w:sz w:val="18"/>
                 <w:szCs w:val="18"/>
               </w:rPr>
-              <w:t xml:space="preserve">3,000mm 기준 최저가 (kg당 3.06~3.31 USD, FOB 칭다오)</w:t>
+              <w:t xml:space="preserve">3,000mm 규격 기준 최저가 수준</w:t>
             </w:r>
           </w:p>
         </w:tc>
@@ -1491,22 +1531,7 @@
           <w:sz w:val="19"/>
           <w:szCs w:val="19"/>
         </w:rPr>
-        <w:t xml:space="preserve">가격 검증 결과: 해당 견적은 성립할 수 없는 금액이었습니다. 6061 알루미늄 빌렛(원소재)의 중국 내 시세가 kg당 약 3.0~3.3 USD 수준인데, 제시된 완제품 단가가 kg당 3.06~3.31 USD였습니다. 압출·단조 가공비, T6 열처리비, 절단·검사·포장비, 마진이 모두 포함되지 않은 가격입니다. 이러한 견적은 선금 입금 후 조건 변경 또는 사양 미달 납품으로 이어질 위험이 있습니다.</w:t>
-      </w:r>
-    </w:p>
-    <w:p>
-      <w:pPr>
-        <w:spacing w:after="70"/>
-      </w:pPr>
-      <w:r>
-        <w:rPr>
-          <w:b w:val="false"/>
-          <w:bCs w:val="false"/>
-          <w:color w:val="6A8898"/>
-          <w:sz w:val="17"/>
-          <w:szCs w:val="17"/>
-        </w:rPr>
-        <w:t xml:space="preserve">※ 원소재 시세는 조사 시점 기준 추정치이며, 발주 시점에 재확인이 필요합니다.</w:t>
+        <w:t xml:space="preserve">가격 검증 결과: 해당 견적은 성립할 수 없는 금액이었습니다. 당사가 6061 알루미늄 원소재의 중국 내 시세와 대조한 결과, 제시된 완제품 단가가 원소재 시세 수준에 불과했습니다. 즉 압출·단조 가공비, T6 열처리비, 절단·검사·포장비가 반영되지 않은 금액입니다. 이러한 견적은 정상적으로 이행될 수 없으며, 선금 입금 후 조건 변경이나 사양 미달 납품으로 이어질 위험이 있습니다.</w:t>
       </w:r>
     </w:p>
     <w:p>
@@ -3907,7 +3932,7 @@
           <w:sz w:val="19"/>
           <w:szCs w:val="19"/>
         </w:rPr>
-        <w:t xml:space="preserve">중개업체의 전형적 위험: 선금(통상 30%)을 먼저 수취한 뒤, 알루미늄 선물 시세가 상승하면 선적을 지연시키거나 단가 인상을 요구하는 사례가 다수 보고됩니다. 자체 생산설비가 없는 중개업체는 원소재를 시세에 따라 조달해야 하므로, 시세가 오르면 당초 견적을 이행할수록 손실이 발생하는 구조이기 때문입니다.</w:t>
+        <w:t xml:space="preserve">중개업체의 전형적 위험: 선금을 먼저 수취한 뒤, 알루미늄 선물 시세가 상승하면 선적을 지연시키거나 단가 인상을 요구하는 사례가 다수 보고됩니다. 자체 생산설비가 없는 중개업체는 원소재를 시세에 따라 조달해야 하므로, 시세가 오르면 당초 견적을 이행할수록 손실이 발생하는 구조이기 때문입니다.</w:t>
       </w:r>
     </w:p>
     <w:p>
@@ -4603,7 +4628,7 @@
           <w:sz w:val="21"/>
           <w:szCs w:val="21"/>
         </w:rPr>
-        <w:t xml:space="preserve">요청 ③ 현 조달 조건 공유</w:t>
+        <w:t xml:space="preserve">요청 ③ 연간 예상 소요량 및 발주 주기</w:t>
       </w:r>
     </w:p>
     <w:p>
@@ -4617,7 +4642,21 @@
           <w:sz w:val="20"/>
           <w:szCs w:val="20"/>
         </w:rPr>
-        <w:t xml:space="preserve">현재 대구경 관을 조달 중인 단가와 리드타임을 공유해 주시면, 신규 업체 견적의 적정성을 판단하는 기준선으로 활용하겠습니다. 앞서 기술한 바와 같이 비정상적으로 낮은 견적은 오히려 위험 신호이므로, 기준선 확보가 중요합니다.</w:t>
+        <w:t xml:space="preserve">본 건 물량(24본)은 대형 제조사 기준으로는 소량에 해당하여, 단발 발주로는 수주 자체가 거절될 수 있습니다. 다만 연간 소요량과 발주 주기가 제시되면 연간 계약 형태로 협의가 가능해져, 대형 제조사의 최소 수량 기준을 충족시킬 수 있습니다.</w:t>
+      </w:r>
+    </w:p>
+    <w:p>
+      <w:pPr>
+        <w:spacing w:after="70"/>
+      </w:pPr>
+      <w:r>
+        <w:rPr>
+          <w:b/>
+          <w:bCs/>
+          <w:sz w:val="20"/>
+          <w:szCs w:val="20"/>
+        </w:rPr>
+        <w:t xml:space="preserve">향후 1년간 예상되는 규격별 소요 수량과 발주 시기를 개략적으로라도 공유해 주시면, 이를 근거로 제조사와 협의하겠습니다. 이는 가격 협상 이전에 수주 가능성 자체를 확보하기 위한 사항입니다.</w:t>
       </w:r>
     </w:p>
     <w:p>

</xml_diff>

<commit_message>
Lead customer report with the 4-stage verification methodology
Co-Authored-By: Claude Fable 5 <noreply@anthropic.com>
Claude-Session: https://claude.ai/code/session_01D8V4YsNDSgybhuKSqPBmt4
</commit_message>
<xml_diff>
--- a/docs/shandong-botong/JSTech_Sourcing_Progress_Report.docx
+++ b/docs/shandong-botong/JSTech_Sourcing_Progress_Report.docx
@@ -164,7 +164,492 @@
           <w:sz w:val="24"/>
           <w:szCs w:val="24"/>
         </w:rPr>
-        <w:t xml:space="preserve">1. 공급사 발굴·검증 경과</w:t>
+        <w:t xml:space="preserve">1. 공급사 발굴·검증 절차</w:t>
+      </w:r>
+    </w:p>
+    <w:p>
+      <w:pPr>
+        <w:spacing w:after="70"/>
+      </w:pPr>
+      <w:r>
+        <w:rPr>
+          <w:b w:val="false"/>
+          <w:bCs w:val="false"/>
+          <w:sz w:val="20"/>
+          <w:szCs w:val="20"/>
+        </w:rPr>
+        <w:t xml:space="preserve">2026년 6월 착수 이후, 다음 4단계 절차로 공급사를 발굴하고 검증하고 있습니다.</w:t>
+      </w:r>
+    </w:p>
+    <w:tbl>
+      <w:tblPr>
+        <w:tblW w:type="dxa" w:w="9306"/>
+        <w:tblBorders>
+          <w:top w:val="single" w:color="auto" w:sz="4"/>
+          <w:left w:val="single" w:color="auto" w:sz="4"/>
+          <w:bottom w:val="single" w:color="auto" w:sz="4"/>
+          <w:right w:val="single" w:color="auto" w:sz="4"/>
+          <w:insideH w:val="single" w:color="auto" w:sz="4"/>
+          <w:insideV w:val="single" w:color="auto" w:sz="4"/>
+        </w:tblBorders>
+      </w:tblPr>
+      <w:tblGrid>
+        <w:gridCol w:w="1500"/>
+        <w:gridCol w:w="3600"/>
+        <w:gridCol w:w="4206"/>
+      </w:tblGrid>
+      <w:tr>
+        <w:tc>
+          <w:tcPr>
+            <w:tcW w:type="dxa" w:w="1500"/>
+            <w:shd w:fill="E4EEF1" w:val="clear"/>
+            <w:tcMar>
+              <w:top w:type="dxa" w:w="55"/>
+              <w:left w:type="dxa" w:w="95"/>
+              <w:bottom w:type="dxa" w:w="55"/>
+              <w:right w:type="dxa" w:w="95"/>
+            </w:tcMar>
+            <w:vAlign w:val="center"/>
+          </w:tcPr>
+          <w:p>
+            <w:pPr>
+              <w:spacing w:after="0"/>
+            </w:pPr>
+            <w:r>
+              <w:rPr>
+                <w:b/>
+                <w:bCs/>
+                <w:color w:val="2E5878"/>
+                <w:sz w:val="18"/>
+                <w:szCs w:val="18"/>
+              </w:rPr>
+              <w:t xml:space="preserve">단계</w:t>
+            </w:r>
+          </w:p>
+        </w:tc>
+        <w:tc>
+          <w:tcPr>
+            <w:tcW w:type="dxa" w:w="3600"/>
+            <w:shd w:fill="E4EEF1" w:val="clear"/>
+            <w:tcMar>
+              <w:top w:type="dxa" w:w="55"/>
+              <w:left w:type="dxa" w:w="95"/>
+              <w:bottom w:type="dxa" w:w="55"/>
+              <w:right w:type="dxa" w:w="95"/>
+            </w:tcMar>
+            <w:vAlign w:val="center"/>
+          </w:tcPr>
+          <w:p>
+            <w:pPr>
+              <w:spacing w:after="0"/>
+            </w:pPr>
+            <w:r>
+              <w:rPr>
+                <w:b/>
+                <w:bCs/>
+                <w:color w:val="2E5878"/>
+                <w:sz w:val="18"/>
+                <w:szCs w:val="18"/>
+              </w:rPr>
+              <w:t xml:space="preserve">수행 내용</w:t>
+            </w:r>
+          </w:p>
+        </w:tc>
+        <w:tc>
+          <w:tcPr>
+            <w:tcW w:type="dxa" w:w="4206"/>
+            <w:shd w:fill="E4EEF1" w:val="clear"/>
+            <w:tcMar>
+              <w:top w:type="dxa" w:w="55"/>
+              <w:left w:type="dxa" w:w="95"/>
+              <w:bottom w:type="dxa" w:w="55"/>
+              <w:right w:type="dxa" w:w="95"/>
+            </w:tcMar>
+            <w:vAlign w:val="center"/>
+          </w:tcPr>
+          <w:p>
+            <w:pPr>
+              <w:spacing w:after="0"/>
+            </w:pPr>
+            <w:r>
+              <w:rPr>
+                <w:b/>
+                <w:bCs/>
+                <w:color w:val="2E5878"/>
+                <w:sz w:val="18"/>
+                <w:szCs w:val="18"/>
+              </w:rPr>
+              <w:t xml:space="preserve">확인 목적</w:t>
+            </w:r>
+          </w:p>
+        </w:tc>
+      </w:tr>
+      <w:tr>
+        <w:tc>
+          <w:tcPr>
+            <w:tcW w:type="dxa" w:w="1500"/>
+            <w:tcMar>
+              <w:top w:type="dxa" w:w="55"/>
+              <w:left w:type="dxa" w:w="95"/>
+              <w:bottom w:type="dxa" w:w="55"/>
+              <w:right w:type="dxa" w:w="95"/>
+            </w:tcMar>
+            <w:vAlign w:val="center"/>
+          </w:tcPr>
+          <w:p>
+            <w:pPr>
+              <w:spacing w:after="0"/>
+            </w:pPr>
+            <w:r>
+              <w:rPr>
+                <w:b w:val="false"/>
+                <w:bCs w:val="false"/>
+                <w:sz w:val="18"/>
+                <w:szCs w:val="18"/>
+              </w:rPr>
+              <w:t xml:space="preserve">1단계
+조사</w:t>
+            </w:r>
+          </w:p>
+        </w:tc>
+        <w:tc>
+          <w:tcPr>
+            <w:tcW w:type="dxa" w:w="3600"/>
+            <w:tcMar>
+              <w:top w:type="dxa" w:w="55"/>
+              <w:left w:type="dxa" w:w="95"/>
+              <w:bottom w:type="dxa" w:w="55"/>
+              <w:right w:type="dxa" w:w="95"/>
+            </w:tcMar>
+            <w:vAlign w:val="center"/>
+          </w:tcPr>
+          <w:p>
+            <w:pPr>
+              <w:spacing w:after="0"/>
+            </w:pPr>
+            <w:r>
+              <w:rPr>
+                <w:b w:val="false"/>
+                <w:bCs w:val="false"/>
+                <w:sz w:val="18"/>
+                <w:szCs w:val="18"/>
+              </w:rPr>
+              <w:t xml:space="preserve">온라인 소싱 플랫폼, 업계 정보, 소개 경로를 통한 후보 발굴</w:t>
+            </w:r>
+          </w:p>
+        </w:tc>
+        <w:tc>
+          <w:tcPr>
+            <w:tcW w:type="dxa" w:w="4206"/>
+            <w:tcMar>
+              <w:top w:type="dxa" w:w="55"/>
+              <w:left w:type="dxa" w:w="95"/>
+              <w:bottom w:type="dxa" w:w="55"/>
+              <w:right w:type="dxa" w:w="95"/>
+            </w:tcMar>
+            <w:vAlign w:val="center"/>
+          </w:tcPr>
+          <w:p>
+            <w:pPr>
+              <w:spacing w:after="0"/>
+            </w:pPr>
+            <w:r>
+              <w:rPr>
+                <w:b w:val="false"/>
+                <w:bCs w:val="false"/>
+                <w:sz w:val="18"/>
+                <w:szCs w:val="18"/>
+              </w:rPr>
+              <w:t xml:space="preserve">해당 규격(대구경·장척) 취급 여부</w:t>
+            </w:r>
+          </w:p>
+        </w:tc>
+      </w:tr>
+      <w:tr>
+        <w:tc>
+          <w:tcPr>
+            <w:tcW w:type="dxa" w:w="1500"/>
+            <w:tcMar>
+              <w:top w:type="dxa" w:w="55"/>
+              <w:left w:type="dxa" w:w="95"/>
+              <w:bottom w:type="dxa" w:w="55"/>
+              <w:right w:type="dxa" w:w="95"/>
+            </w:tcMar>
+            <w:vAlign w:val="center"/>
+          </w:tcPr>
+          <w:p>
+            <w:pPr>
+              <w:spacing w:after="0"/>
+            </w:pPr>
+            <w:r>
+              <w:rPr>
+                <w:b w:val="false"/>
+                <w:bCs w:val="false"/>
+                <w:sz w:val="18"/>
+                <w:szCs w:val="18"/>
+              </w:rPr>
+              <w:t xml:space="preserve">2단계
+접촉</w:t>
+            </w:r>
+          </w:p>
+        </w:tc>
+        <w:tc>
+          <w:tcPr>
+            <w:tcW w:type="dxa" w:w="3600"/>
+            <w:tcMar>
+              <w:top w:type="dxa" w:w="55"/>
+              <w:left w:type="dxa" w:w="95"/>
+              <w:bottom w:type="dxa" w:w="55"/>
+              <w:right w:type="dxa" w:w="95"/>
+            </w:tcMar>
+            <w:vAlign w:val="center"/>
+          </w:tcPr>
+          <w:p>
+            <w:pPr>
+              <w:spacing w:after="0"/>
+            </w:pPr>
+            <w:r>
+              <w:rPr>
+                <w:b w:val="false"/>
+                <w:bCs w:val="false"/>
+                <w:sz w:val="18"/>
+                <w:szCs w:val="18"/>
+              </w:rPr>
+              <w:t xml:space="preserve">이메일·전화·현지 언어 통화로 직접 접촉하여 기술 문의 진행</w:t>
+            </w:r>
+          </w:p>
+        </w:tc>
+        <w:tc>
+          <w:tcPr>
+            <w:tcW w:type="dxa" w:w="4206"/>
+            <w:tcMar>
+              <w:top w:type="dxa" w:w="55"/>
+              <w:left w:type="dxa" w:w="95"/>
+              <w:bottom w:type="dxa" w:w="55"/>
+              <w:right w:type="dxa" w:w="95"/>
+            </w:tcMar>
+            <w:vAlign w:val="center"/>
+          </w:tcPr>
+          <w:p>
+            <w:pPr>
+              <w:spacing w:after="0"/>
+            </w:pPr>
+            <w:r>
+              <w:rPr>
+                <w:b w:val="false"/>
+                <w:bCs w:val="false"/>
+                <w:sz w:val="18"/>
+                <w:szCs w:val="18"/>
+              </w:rPr>
+              <w:t xml:space="preserve">제조사 여부, 인증서 보유 및 발급 준비 상태, 기술 질의에 대한 응답 수준</w:t>
+            </w:r>
+          </w:p>
+        </w:tc>
+      </w:tr>
+      <w:tr>
+        <w:tc>
+          <w:tcPr>
+            <w:tcW w:type="dxa" w:w="1500"/>
+            <w:tcMar>
+              <w:top w:type="dxa" w:w="55"/>
+              <w:left w:type="dxa" w:w="95"/>
+              <w:bottom w:type="dxa" w:w="55"/>
+              <w:right w:type="dxa" w:w="95"/>
+            </w:tcMar>
+            <w:vAlign w:val="center"/>
+          </w:tcPr>
+          <w:p>
+            <w:pPr>
+              <w:spacing w:after="0"/>
+            </w:pPr>
+            <w:r>
+              <w:rPr>
+                <w:b w:val="false"/>
+                <w:bCs w:val="false"/>
+                <w:sz w:val="18"/>
+                <w:szCs w:val="18"/>
+              </w:rPr>
+              <w:t xml:space="preserve">3단계
+자료 검증</w:t>
+            </w:r>
+          </w:p>
+        </w:tc>
+        <w:tc>
+          <w:tcPr>
+            <w:tcW w:type="dxa" w:w="3600"/>
+            <w:tcMar>
+              <w:top w:type="dxa" w:w="55"/>
+              <w:left w:type="dxa" w:w="95"/>
+              <w:bottom w:type="dxa" w:w="55"/>
+              <w:right w:type="dxa" w:w="95"/>
+            </w:tcMar>
+            <w:vAlign w:val="center"/>
+          </w:tcPr>
+          <w:p>
+            <w:pPr>
+              <w:spacing w:after="0"/>
+            </w:pPr>
+            <w:r>
+              <w:rPr>
+                <w:b w:val="false"/>
+                <w:bCs w:val="false"/>
+                <w:sz w:val="18"/>
+                <w:szCs w:val="18"/>
+              </w:rPr>
+              <w:t xml:space="preserve">회사 정보·인증서·재질성적서·견적 수령 후 상호 대조</w:t>
+            </w:r>
+          </w:p>
+        </w:tc>
+        <w:tc>
+          <w:tcPr>
+            <w:tcW w:type="dxa" w:w="4206"/>
+            <w:tcMar>
+              <w:top w:type="dxa" w:w="55"/>
+              <w:left w:type="dxa" w:w="95"/>
+              <w:bottom w:type="dxa" w:w="55"/>
+              <w:right w:type="dxa" w:w="95"/>
+            </w:tcMar>
+            <w:vAlign w:val="center"/>
+          </w:tcPr>
+          <w:p>
+            <w:pPr>
+              <w:spacing w:after="0"/>
+            </w:pPr>
+            <w:r>
+              <w:rPr>
+                <w:b w:val="false"/>
+                <w:bCs w:val="false"/>
+                <w:sz w:val="18"/>
+                <w:szCs w:val="18"/>
+              </w:rPr>
+              <w:t xml:space="preserve">서류 간 정합성, 인증서 유효기간, 요구 사양 대응 가능 여부</w:t>
+            </w:r>
+          </w:p>
+        </w:tc>
+      </w:tr>
+      <w:tr>
+        <w:tc>
+          <w:tcPr>
+            <w:tcW w:type="dxa" w:w="1500"/>
+            <w:tcMar>
+              <w:top w:type="dxa" w:w="55"/>
+              <w:left w:type="dxa" w:w="95"/>
+              <w:bottom w:type="dxa" w:w="55"/>
+              <w:right w:type="dxa" w:w="95"/>
+            </w:tcMar>
+            <w:vAlign w:val="center"/>
+          </w:tcPr>
+          <w:p>
+            <w:pPr>
+              <w:spacing w:after="0"/>
+            </w:pPr>
+            <w:r>
+              <w:rPr>
+                <w:b w:val="false"/>
+                <w:bCs w:val="false"/>
+                <w:sz w:val="18"/>
+                <w:szCs w:val="18"/>
+              </w:rPr>
+              <w:t xml:space="preserve">4단계
+현장 확인</w:t>
+            </w:r>
+          </w:p>
+        </w:tc>
+        <w:tc>
+          <w:tcPr>
+            <w:tcW w:type="dxa" w:w="3600"/>
+            <w:tcMar>
+              <w:top w:type="dxa" w:w="55"/>
+              <w:left w:type="dxa" w:w="95"/>
+              <w:bottom w:type="dxa" w:w="55"/>
+              <w:right w:type="dxa" w:w="95"/>
+            </w:tcMar>
+            <w:vAlign w:val="center"/>
+          </w:tcPr>
+          <w:p>
+            <w:pPr>
+              <w:spacing w:after="0"/>
+            </w:pPr>
+            <w:r>
+              <w:rPr>
+                <w:b w:val="false"/>
+                <w:bCs w:val="false"/>
+                <w:sz w:val="18"/>
+                <w:szCs w:val="18"/>
+              </w:rPr>
+              <w:t xml:space="preserve">유력 업체부터 순차적으로 직접 방문</w:t>
+            </w:r>
+          </w:p>
+        </w:tc>
+        <w:tc>
+          <w:tcPr>
+            <w:tcW w:type="dxa" w:w="4206"/>
+            <w:tcMar>
+              <w:top w:type="dxa" w:w="55"/>
+              <w:left w:type="dxa" w:w="95"/>
+              <w:bottom w:type="dxa" w:w="55"/>
+              <w:right w:type="dxa" w:w="95"/>
+            </w:tcMar>
+            <w:vAlign w:val="center"/>
+          </w:tcPr>
+          <w:p>
+            <w:pPr>
+              <w:spacing w:after="0"/>
+            </w:pPr>
+            <w:r>
+              <w:rPr>
+                <w:b w:val="false"/>
+                <w:bCs w:val="false"/>
+                <w:sz w:val="18"/>
+                <w:szCs w:val="18"/>
+              </w:rPr>
+              <w:t xml:space="preserve">제출 자료와 실제 설비의 일치 여부, 실제 제조 역량 보유 여부</w:t>
+            </w:r>
+          </w:p>
+        </w:tc>
+      </w:tr>
+    </w:tbl>
+    <w:p>
+      <w:pPr>
+        <w:spacing w:after="70"/>
+      </w:pPr>
+      <w:r>
+        <w:rPr>
+          <w:b w:val="false"/>
+          <w:bCs w:val="false"/>
+          <w:sz w:val="20"/>
+          <w:szCs w:val="20"/>
+        </w:rPr>
+        <w:t xml:space="preserve"/>
+      </w:r>
+    </w:p>
+    <w:p>
+      <w:pPr>
+        <w:spacing w:after="40"/>
+      </w:pPr>
+      <w:r>
+        <w:rPr>
+          <w:b w:val="false"/>
+          <w:bCs w:val="false"/>
+          <w:sz w:val="20"/>
+          <w:szCs w:val="20"/>
+        </w:rPr>
+        <w:t xml:space="preserve">1~3단계는 원격으로 수행이 가능하나, 4단계는 현지 방문이 필요합니다. 앞 단계에서 걸러지지 않는 사항이 현장에서 드러나기 때문에 이 순서를 유지하고 있습니다. 실제로 본 보고서 2장의 사례 ①은 1~3단계를 모두 통과한 업체였습니다.</w:t>
+      </w:r>
+    </w:p>
+    <w:p>
+      <w:pPr>
+        <w:spacing w:after="70" w:before="190"/>
+      </w:pPr>
+      <w:r>
+        <w:rPr>
+          <w:b/>
+          <w:bCs/>
+          <w:color w:val="2E5878"/>
+          <w:sz w:val="21"/>
+          <w:szCs w:val="21"/>
+        </w:rPr>
+        <w:t xml:space="preserve">1-1. 단계별 진행 결과</w:t>
       </w:r>
     </w:p>
     <w:tbl>
@@ -265,7 +750,7 @@
                 <w:sz w:val="18"/>
                 <w:szCs w:val="18"/>
               </w:rPr>
-              <w:t xml:space="preserve">내용</w:t>
+              <w:t xml:space="preserve">결과</w:t>
             </w:r>
           </w:p>
         </w:tc>
@@ -293,7 +778,7 @@
                 <w:sz w:val="18"/>
                 <w:szCs w:val="18"/>
               </w:rPr>
-              <w:t xml:space="preserve">1차 검토</w:t>
+              <w:t xml:space="preserve">1단계 조사</w:t>
             </w:r>
           </w:p>
         </w:tc>
@@ -345,7 +830,7 @@
                 <w:sz w:val="18"/>
                 <w:szCs w:val="18"/>
               </w:rPr>
-              <w:t xml:space="preserve">온라인 소싱, 소개, 직접 접촉을 통한 1차 조사</w:t>
+              <w:t xml:space="preserve">후보 발굴</w:t>
             </w:r>
           </w:p>
         </w:tc>
@@ -373,7 +858,7 @@
                 <w:sz w:val="18"/>
                 <w:szCs w:val="18"/>
               </w:rPr>
-              <w:t xml:space="preserve">2차 자료 확보</w:t>
+              <w:t xml:space="preserve">2단계 접촉</w:t>
             </w:r>
           </w:p>
         </w:tc>
@@ -453,7 +938,7 @@
                 <w:sz w:val="18"/>
                 <w:szCs w:val="18"/>
               </w:rPr>
-              <w:t xml:space="preserve">3차 견적 확보</w:t>
+              <w:t xml:space="preserve">3단계 자료 검증</w:t>
             </w:r>
           </w:p>
         </w:tc>
@@ -505,7 +990,7 @@
                 <w:sz w:val="18"/>
                 <w:szCs w:val="18"/>
               </w:rPr>
-              <w:t xml:space="preserve">실제 견적서 수령 (FOB / CIF 조건별)</w:t>
+              <w:t xml:space="preserve">자료 및 견적 수령, 사양 대응 가능 여부 확인</w:t>
             </w:r>
           </w:p>
         </w:tc>
@@ -534,7 +1019,7 @@
                 <w:sz w:val="18"/>
                 <w:szCs w:val="18"/>
               </w:rPr>
-              <w:t xml:space="preserve">4차 실체 검증</w:t>
+              <w:t xml:space="preserve">4단계 현장 확인</w:t>
             </w:r>
           </w:p>
         </w:tc>
@@ -671,7 +1156,7 @@
                 <w:sz w:val="18"/>
                 <w:szCs w:val="18"/>
               </w:rPr>
-              <w:t xml:space="preserve">대구경 생산 가능 설비를 보유한 중견 제조사 대상</w:t>
+              <w:t xml:space="preserve">대구경 생산 가능 설비를 보유한 중견 제조사 대상, 순차 방문 예정</w:t>
             </w:r>
           </w:p>
         </w:tc>
@@ -693,16 +1178,42 @@
     </w:p>
     <w:p>
       <w:pPr>
-        <w:spacing w:after="40"/>
-      </w:pPr>
-      <w:r>
-        <w:rPr>
-          <w:b w:val="false"/>
-          <w:bCs w:val="false"/>
-          <w:sz w:val="20"/>
-          <w:szCs w:val="20"/>
-        </w:rPr>
-        <w:t xml:space="preserve">중국 알루미늄 업계는 홈페이지·카탈로그·인증서 사본만으로는 실제 제조사 여부를 판별할 수 없습니다. 서류상으로는 제조사로 표기되어 있으나 실제로는 중개만 하는 업체가 다수이며, 이를 걸러내는 데 검토 기간의 상당 부분이 소요되었습니다.</w:t>
+        <w:pBdr>
+          <w:top w:val="single" w:color="5A9A96" w:sz="4"/>
+          <w:left w:val="single" w:color="5A9A96" w:sz="24"/>
+        </w:pBdr>
+        <w:shd w:fill="EAF2F4" w:val="clear"/>
+        <w:spacing w:after="0" w:before="80"/>
+        <w:ind w:left="160" w:right="160"/>
+      </w:pPr>
+      <w:r>
+        <w:rPr>
+          <w:b/>
+          <w:bCs/>
+          <w:color w:val="1F3D4A"/>
+          <w:sz w:val="20"/>
+          <w:szCs w:val="20"/>
+        </w:rPr>
+        <w:t xml:space="preserve">검증에 시간을 투입하는 이유</w:t>
+      </w:r>
+    </w:p>
+    <w:p>
+      <w:pPr>
+        <w:pBdr>
+          <w:bottom w:val="single" w:color="5A9A96" w:sz="4"/>
+          <w:left w:val="single" w:color="5A9A96" w:sz="24"/>
+        </w:pBdr>
+        <w:shd w:fill="EAF2F4" w:val="clear"/>
+        <w:spacing w:after="120" w:before="30"/>
+        <w:ind w:left="160" w:right="160"/>
+      </w:pPr>
+      <w:r>
+        <w:rPr>
+          <w:color w:val="203038"/>
+          <w:sz w:val="19"/>
+          <w:szCs w:val="19"/>
+        </w:rPr>
+        <w:t xml:space="preserve">중국 알루미늄 업계는 실제 제조사와 중개업체가 동일한 형태의 회사 소개, 카탈로그, 인증서 사본을 제출합니다. 서류만으로는 구분되지 않으며, 4단계의 현장 확인에서 비로소 판별됩니다. 본 건은 단발 구매가 아니라 지속적으로 공급받을 공급망을 구성하는 것이 목적이므로, 초기 검증에 충분한 시간을 투입하고 있습니다. 초기에 확인하지 않은 사항은 양산 단계에서 훨씬 큰 비용으로 되돌아오기 때문입니다.</w:t>
       </w:r>
     </w:p>
     <w:p>

</xml_diff>